<commit_message>
Figure 3: widen to remove label overlap; propagate to all artefacts
The eleven-method modelling battery figure had the long method names on
its AUC panel y-axis crowding into the calibration bar panel.  Widened
the figure from 7.5" to 9.5" and tilted the width_ratios toward the
AUC panel (1.9:1.0 instead of 1.6:1.0) so the labels now have room.

Re-propagated to:
- figures/F3_method_battery.{png,pdf}
- Manuscript_05192026/Figure_3.tiff (300 dpi LZW)
- docs/main_manuscript.docx  (embedded F3)
- Manuscript_05192026/Slides.pptx (embedded F3 in slide 7)
- docs/Code_Companion.{docx,pdf}  (no embedded F3, but text references F3)
</commit_message>
<xml_diff>
--- a/docs/main_manuscript.docx
+++ b/docs/main_manuscript.docx
@@ -2436,7 +2436,7 @@
       <w:r>
         <w:drawing>
           <wp:inline xmlns:a="http://schemas.openxmlformats.org/drawingml/2006/main" xmlns:pic="http://schemas.openxmlformats.org/drawingml/2006/picture">
-            <wp:extent cx="5943600" cy="5040130"/>
+            <wp:extent cx="5943600" cy="4188144"/>
             <wp:docPr id="3" name="Picture 3"/>
             <wp:cNvGraphicFramePr>
               <a:graphicFrameLocks noChangeAspect="1"/>
@@ -2457,7 +2457,7 @@
                   <pic:spPr>
                     <a:xfrm>
                       <a:off x="0" y="0"/>
-                      <a:ext cx="5943600" cy="5040130"/>
+                      <a:ext cx="5943600" cy="4188144"/>
                     </a:xfrm>
                     <a:prstGeom prst="rect"/>
                   </pic:spPr>

</xml_diff>

<commit_message>
Figure 4 bottom note: wrap to a narrower block (~5 cm less width)
The figure-level explanatory notes under Figure 4 previously spanned
the full figure width as two long single-line strings. They are now
re-wrapped into a compact left-justified block:

  Prediction-set categories:
      {no seizure}              →  rule-out (skip AED)
      {seizure}                 →  rule-in  (target cEEG)
      {seizure, no seizure} →  defer to clinical judgment.

  postop_A and postop_B differ only in postop_B omitting
  three variables (AED timing, prophylactic AED, abnormal
  EEG) that could be charted after seizure onset.

The block now occupies roughly the left ~60% of the figure width,
about 5 cm narrower than before. Linespacing tuned for clean stacking.

Re-propagated to: main_manuscript.docx, supplementary.docx, Code_Companion
(docx + pdf + tex), Figure_4.tiff, Slides.pptx (slide 10).

Slides_v2_NP.pptx left untouched as requested — timestamp confirms
the file has not been modified.
</commit_message>
<xml_diff>
--- a/docs/main_manuscript.docx
+++ b/docs/main_manuscript.docx
@@ -2642,7 +2642,7 @@
       <w:r>
         <w:drawing>
           <wp:inline xmlns:a="http://schemas.openxmlformats.org/drawingml/2006/main" xmlns:pic="http://schemas.openxmlformats.org/drawingml/2006/picture">
-            <wp:extent cx="5943600" cy="2269284"/>
+            <wp:extent cx="5943600" cy="4212955"/>
             <wp:docPr id="4" name="Picture 4"/>
             <wp:cNvGraphicFramePr>
               <a:graphicFrameLocks noChangeAspect="1"/>
@@ -2663,7 +2663,7 @@
                   <pic:spPr>
                     <a:xfrm>
                       <a:off x="0" y="0"/>
-                      <a:ext cx="5943600" cy="2269284"/>
+                      <a:ext cx="5943600" cy="4212955"/>
                     </a:xfrm>
                     <a:prstGeom prst="rect"/>
                   </pic:spPr>

</xml_diff>

<commit_message>
Phase 4: rewrite Title/Abstract/Discussion (M1, M3, S1-S3, F1-F6)
- Title: drop 'conformally-deployable' overclaim -> 'calibrated, conformal-prediction
  proof-of-concept'
- Abstract: report BOTH AUCs (deployable postop-B 0.645; postop-A 0.681 incl. peri-decision
  vars); conditional CEA (active strategies dominate observation; universal-vs-ML depends on
  AED efficacy/harm); drop stale $190M EVPI; calibration via Brier/CITL not slope
- Discussion: 'meets methodological preconditions for prospective evaluation' (not 'deployable');
  honest I2 (logit 0%, raw up to 56%, report prediction interval); conditional CEA; slope>1 stated
- F6 added (VOI recompute needed before quoting EVPI)
</commit_message>
<xml_diff>
--- a/docs/main_manuscript.docx
+++ b/docs/main_manuscript.docx
@@ -12,7 +12,7 @@
           <w:b/>
           <w:sz w:val="30"/>
         </w:rPr>
-        <w:t>A calibrated and conformally-deployable risk score for postoperative seizure after chronic subdural haematoma evacuation: a proof-of-concept multi-database study with value-of-information analysis</w:t>
+        <w:t>Postoperative seizure after chronic subdural haematoma evacuation: a calibrated, conformal-prediction proof-of-concept with multi-database validation and value-of-information analysis</w:t>
       </w:r>
     </w:p>
     <w:p>
@@ -215,7 +215,7 @@
           <w:i w:val="0"/>
           <w:sz w:val="22"/>
         </w:rPr>
-        <w:t>Postoperative seizure complicates 7–12% of chronic subdural haematoma (cSDH) evacuations, but routine antiepileptic drug (AED) prophylaxis carries fall, cognitive and drug-interaction risks specific to elderly patients. Calibrated, deployable risk stratification is needed.</w:t>
+        <w:t>Postoperative seizure complicates 7–12% of chronic subdural haematoma (cSDH) evacuations, but routine antiepileptic drug (AED) prophylaxis carries fall, cognitive and drug-interaction risks specific to elderly patients, and its efficacy after cSDH is unproven. Calibrated risk stratification that can support individual treatment decisions is needed.</w:t>
       </w:r>
     </w:p>
     <w:p>
@@ -263,7 +263,7 @@
           <w:i w:val="0"/>
           <w:sz w:val="22"/>
         </w:rPr>
-        <w:t>Firth penalized logistic regression — selected as the deployment model — discriminated at AUC 0.681 (95% CI 0.609–0.753), equivalent to BalancedRandomForest (DeLong p = 0.81), with 3.3-fold better calibration (Brier 0.069 vs 0.228). Eleven-method comparison confirmed an AUC ceiling near 0.68 consistent with 2022–2025 meta-evidence. eICU external AUC was 0.750 (0.711–0.774); random-effects pooled AUC across 42 hospitals was 0.684 (0.651–0.714), I²=0%. Conformal prediction at α=0.10 produced confident singleton predictions in 37% of patients (rule-out of seizure in 27%; rule-in 11%). ML-guided AED prophylaxis dominated observation and universal AED on both cost and QALYs. Population EVPI at $100k/QALY was $190M over 10 years.</w:t>
+        <w:t>Firth penalized logistic regression was the deployment model, fit on a leakage-safe postoperative-B feature set (18 variables available at the end of evacuation, before the AED/EEG decision); it discriminated at AUC 0.645. A postoperative-A set that additionally included three peri-decision variables reached AUC 0.681 (95% CI 0.609–0.753) but is not deployable, the difference lying within the Bernoulli noise floor at 48 events. Firth matched BalancedRandomForest discrimination (DeLong p = 0.81) with markedly better calibration (Brier 0.069 vs 0.228) and calibration-in-the-large near zero. Eleven model classes converged on an AUC ceiling near 0.68 consistent with 2022–2025 meta-evidence. eICU external AUC was 0.750 (0.711–0.774); random-effects pooled AUC across 42 hospitals was 0.684 (0.651–0.714). Class-conditional conformal prediction at α=0.10 gave confident singleton predictions in 37% of patients (rule-out 27%; rule-in 11%). All active prophylaxis strategies dominated observation; the choice between universal AED and ML-guided allocation depended on AED efficacy and harm — both uncertain in cSDH — with ML-guided allocation cost-effective under cSDH-plausible values. Value-of-information identified AED efficacy and AED harm as the dominant research priorities.</w:t>
       </w:r>
     </w:p>
     <w:p>
@@ -287,7 +287,7 @@
           <w:i w:val="0"/>
           <w:sz w:val="22"/>
         </w:rPr>
-        <w:t>Small-cohort clinical machine learning can be deployable when calibration and decision-integration replace discrimination as the optimisation target. ML-guided AED prophylaxis is cost-effective; VOI prioritises per-day cEEG cost, baseline seizure prevalence and AED efficacy as research targets.</w:t>
+        <w:t>For postoperative seizure after cSDH evacuation, optimising small-cohort clinical machine learning for calibration and individual-patient decision support — rather than discrimination — yields a candidate model that meets methodological preconditions for prospective clinical evaluation. Whether selective ML-guided prophylaxis is preferable to treating all or none hinges on AED efficacy and harm in cSDH, which current evidence leaves uncertain; value-of-information prioritises resolving these.</w:t>
       </w:r>
     </w:p>
     <w:p>
@@ -1176,7 +1176,7 @@
           <w:i w:val="0"/>
           <w:sz w:val="22"/>
         </w:rPr>
-        <w:t>This proof-of-concept study demonstrates that small-cohort clinical machine learning for postoperative seizure after cSDH evacuation can be deployable when calibration and individual-patient decision support — not discrimination — are treated as the optimisation target. Firth penalized logistic regression matches BalancedRandomForest on AUC, delivers three-fold better calibration, and supports class-conditional conformal prediction sets that confidently rule out seizure in approximately one quarter of patients at a 90% coverage guarantee. External validation across BIDMC and the eICU Collaborative Research Database confirms low between-hospital heterogeneity (I² = 0%).</w:t>
+        <w:t>This proof-of-concept study shows that, for postoperative seizure after cSDH evacuation, optimising small-cohort clinical machine learning for calibration and individual-patient decision support — rather than discrimination — yields a candidate model that meets methodological preconditions for prospective clinical evaluation. Firth penalized logistic regression matches BalancedRandomForest on AUC, delivers three-fold better calibration, and supports class-conditional conformal prediction sets that confidently rule out seizure in approximately one quarter of patients at a 90% coverage guarantee. External evaluation across BIDMC and the eICU Collaborative Research Database showed low between-hospital heterogeneity on the variance-stabilising logit scale (I² = 0%); a raw-AUC sensitivity analysis gave higher estimates (I² up to ~56%), so we report the random-effects prediction interval (Appendix S7) as the more honest summary of cross-site transportability.</w:t>
       </w:r>
     </w:p>
     <w:p>
@@ -1246,7 +1246,7 @@
           <w:i w:val="0"/>
           <w:sz w:val="22"/>
         </w:rPr>
-        <w:t>The decision-analytic integration shows that the calibrated deployment model translates directly into clinical value. ML-guided AED prophylaxis dominated current strategies on both cost and QALY axes, and the accompanying value-of-information analysis — to our knowledge the first applied to this clinical question — quantifies the population-scale upper bound on future research investment at approximately $190 million over 10 years. The analysis identifies *which* parameters drive the upper bound: per-day cEEG cost, baseline seizure prevalence, and AED relative-risk reduction. Each is addressable through prospective data collection or focused trials.</w:t>
+        <w:t>The decision-analytic integration clarifies where the calibrated model could change practice. All active prophylaxis strategies (universal AED, ML-guided AED, ML-guided cEEG) dominated watchful observation. The choice among the active strategies, however, is not settled by the model alone: it depends on two cSDH-specific parameters that the evidence leaves genuinely uncertain — the efficacy of AED prophylaxis (no randomised trial exists, and pooled observational estimates show no significant seizure reduction) and its disutility in elderly patients (falls, sedation, cognition). One-way sensitivity analysis at $100k/QALY shows AED efficacy and AED harm dominate the decision: under cSDH-plausible values (AED relative-risk reduction at or below 0.30, or a non-trivial AED disutility) ML-guided allocation has the highest expected net benefit, whereas universal AED is preferable only under the optimistic, externally-imported assumptions of strong efficacy and negligible harm. The accompanying value-of-information analysis — to our knowledge the first applied to this question — accordingly ranks AED efficacy and AED harm as the priority targets for prospective data collection.</w:t>
       </w:r>
     </w:p>
     <w:p>
@@ -1278,7 +1278,7 @@
           <w:i w:val="0"/>
           <w:sz w:val="22"/>
         </w:rPr>
-        <w:t>This study has limitations. The development cohort is single-institution, partly mitigated by external evaluation across 139 eICU hospitals with zero between-site heterogeneity. The structured electronic medical record lacks imaging features known to inform seizure risk (sulcal effacement, midline shift magnitude, density heterogeneity); future work could augment the deployment model with imaging-derived covariates extracted from radiology free-text or directly from CT scans. Outcome ascertainment is administrative rather than EEG-adjudicated; sensitivity analyses across four time-window cuts preserved the primary AUC. Cost inputs adopt the US-payer perspective; the VOI analysis explicitly identifies per-day cEEG cost as the highest-EVPPI parameter for international refinement.</w:t>
+        <w:t>This study has limitations. The development cohort is single-institution, partly mitigated by external evaluation across 42 eICU hospitals with low logit-scale between-site heterogeneity. Calibration-in-the-large and decision-curve net benefit are the robust calibration findings; the recalibration slope exceeds one (under-dispersed predictions), reflecting weak discrimination over a narrow probability range at 48 events. The structured electronic medical record lacks imaging features known to inform seizure risk (sulcal effacement, midline shift magnitude, density heterogeneity); future work could augment the deployment model with imaging-derived covariates extracted from radiology free-text or directly from CT scans. Outcome ascertainment is administrative rather than EEG-adjudicated; sensitivity analyses across four time-window cuts preserved the primary AUC. Cost inputs adopt the US-payer perspective; the VOI analysis explicitly identifies per-day cEEG cost as the highest-EVPPI parameter for international refinement.</w:t>
       </w:r>
     </w:p>
     <w:p>
@@ -1294,7 +1294,7 @@
           <w:i w:val="0"/>
           <w:sz w:val="22"/>
         </w:rPr>
-        <w:t>In conclusion, calibrated, conformally-deployable machine-learning prediction of postoperative seizure after cSDH evacuation is feasible and supports individual-patient decisions with formal coverage guarantees. ML-guided AED prophylaxis dominates current strategies in a refreshed cost-effectiveness analysis, and value-of-information analysis ranks per-day cEEG cost, seizure prevalence and AED efficacy as the priority targets for future research investment.</w:t>
+        <w:t>In conclusion, calibrated machine-learning prediction of postoperative seizure after cSDH evacuation, paired with class-conditional conformal prediction, is feasible and meets methodological preconditions for prospective evaluation, supporting individual-patient decisions with formal coverage guarantees. Active prophylaxis dominates watchful observation; whether to allocate it selectively with the model rather than treat all patients depends on AED efficacy and harm in cSDH, which current evidence leaves uncertain, and which value-of-information identifies as the priority targets for future research.</w:t>
       </w:r>
     </w:p>
     <w:p>

</xml_diff>

<commit_message>
Phase 4: Methods/Results rewrite + new appendices S6-S8 (M1,M2,M3,M4,S4,S5,S9-S13)
- M1: deployment set + timepoint in Outcome/Modelling; deployable postop-B leads Results
- M2: cohort reconciliation (5,376/139 screen -> 3,297/42 primary) + CONSORT (Appendix S8)
- M3: conditional CEA in Results (operating point S9 table, threshold, tornado, international)
- M4: conformal->action mapping in Methods + Appendix S6 sensitivity
- S5 Fig3 caption (15 rows = 11 classes + 4 variants); S13 prior-predictor + novelty para
- F1: honest calibration (slope>1) in Results §3.3; fixed add_table_from_df index bug
- New Appendices S6 (conformal/CEA sensitivity), S7 (LOHO heterogeneity), S8 (CONSORT + coefficients)
</commit_message>
<xml_diff>
--- a/docs/main_manuscript.docx
+++ b/docs/main_manuscript.docx
@@ -239,7 +239,7 @@
           <w:i w:val="0"/>
           <w:sz w:val="22"/>
         </w:rPr>
-        <w:t>We developed and externally evaluated a machine-learning risk score for postoperative seizure in 655 cSDH evacuations at BIDMC (development; 48 events) and 5,376 SDH ICU stays across 139 hospitals in the eICU Collaborative Research Database (external validation). Eleven model classes were compared, including six SMOTE-family oversamplers, Optuna-tuned XGBoost and LightGBM, a diverse-base stacking ensemble, Bayesian logistic regression with eICU-informed priors, and Firth penalized logistic regression. Class-conditional (Mondrian) conformal prediction provided individual-patient decision sets. A probabilistic cost-effectiveness analysis with value-of-information (VOI) was run on 10,000 Monte Carlo iterations.</w:t>
+        <w:t>We developed and externally evaluated a machine-learning risk score for postoperative seizure in 655 cSDH evacuations at BIDMC (development; 48 events) and 3,297 non-traumatic subdural haematoma ICU stays across 42 hospitals in the eICU Collaborative Research Database (external validation; 300 seizures). Eleven model classes were compared, including six SMOTE-family oversamplers, Optuna-tuned XGBoost and LightGBM, a diverse-base stacking ensemble, Bayesian logistic regression with eICU-informed priors, and Firth penalized logistic regression. Class-conditional (Mondrian) conformal prediction provided individual-patient decision sets. A probabilistic cost-effectiveness analysis with value-of-information (VOI) was run on 10,000 Monte Carlo iterations.</w:t>
       </w:r>
     </w:p>
     <w:p>
@@ -619,7 +619,7 @@
           <w:i w:val="0"/>
           <w:sz w:val="22"/>
         </w:rPr>
-        <w:t>The BIDMC development cohort comprised all consecutive patients undergoing burr-hole or craniotomy for cSDH between January 2010 and December 2023 (n = 655; 48 in-admission postoperative seizures). The eICU non-traumatic SDH stratum served as the primary external-validation cohort (n = 3,297; 300 seizures), with sensitivity to four cohort definitions reported in the Supplement.</w:t>
+        <w:t>The BIDMC development cohort comprised all consecutive patients undergoing burr-hole or craniotomy for cSDH between January 2010 and December 2023 (n = 655; 48 in-admission postoperative seizures). For external validation, the eICU Collaborative Research Database was screened in stages: 5,376 ICU stays with any subdural haematoma diagnosis across 139 hospitals were identified, from which the pre-specified primary stratum — non-traumatic SDH stays at hospitals contributing ≥10 such stays — yielded 3,297 stays across 42 hospitals (300 seizures). All headline external figures, including the leave-one-hospital-out pooling, use this 3,297/42 primary stratum; the broader 5,376/139 screen and three alternative cohort definitions are reported as sensitivity analyses in the Supplement, and a CONSORT-style inclusion-flow diagram (Supplementary Appendix S8) details every exclusion step.</w:t>
       </w:r>
     </w:p>
     <w:p>
@@ -647,7 +647,7 @@
           <w:i w:val="0"/>
           <w:sz w:val="22"/>
         </w:rPr>
-        <w:t>The primary outcome was any postoperative seizure within the index admission, ascertained from chart documentation at BIDMC and from the structured seizure flag in eICU. The BIDMC postoperative-A feature set comprised 21 demographic, operative and imaging-derived variables; postoperative-B excluded three variables potentially recorded after seizure onset. The full feature dictionary is in Supplementary Appendix S3.</w:t>
+        <w:t>The primary outcome was any postoperative seizure within the index admission, ascertained from chart documentation at BIDMC and from the structured seizure flag in eICU; cross-database phenotype agreement supports the external-validity claim. Two feature sets were defined by their availability at the intended decision point — the end of haematoma evacuation, before the antiepileptic-drug/EEG decision. The deployable postoperative-B set comprised 18 demographic, operative and imaging-derived variables all available at that point. The postoperative-A set added three peri-decision variables (AED timing, proportion of stay on AED, abnormal EEG) that a clinician could not have at evacuation exit; because these encode information generated around or after the very decision the model is meant to inform, postoperative-A is reported only as a paired sensitivity comparison and is not deployable. The full feature dictionary is in Supplementary Appendix S3.</w:t>
       </w:r>
     </w:p>
     <w:p>
@@ -675,7 +675,7 @@
           <w:i w:val="0"/>
           <w:sz w:val="22"/>
         </w:rPr>
-        <w:t>Eleven model classes were compared: the prior version's BalancedRandomForest (BRF) reference; Firth penalized logistic regression; Bayesian logistic regression with weakly-informative and eICU-informed priors; class-weighted RandomForest; six SMOTE-family oversampling variants (SMOTE, Borderline-SMOTE, SVM-SMOTE, ADASYN, SMOTEENN, SMOTETomek); Optuna-tuned XGBoost and LightGBM (40 trials each); and a diverse-base stacking ensemble (logistic regression, BRF, XGBoost, k-nearest neighbours and RBF-SVM) with logistic meta-learner. Models were evaluated by 5×5 repeated stratified cross-validation with bootstrap 95% confidence intervals on AUC, Brier score, calibration-in-the-large, calibration slope and intercept. Paired comparisons against BRF used the DeLong test.</w:t>
+        <w:t>Eleven model classes were compared: the prior version's BalancedRandomForest (BRF) reference; Firth penalized logistic regression; Bayesian logistic regression with weakly-informative and eICU-informed priors; class-weighted RandomForest; six SMOTE-family oversampling variants (SMOTE, Borderline-SMOTE, SVM-SMOTE, ADASYN, SMOTEENN, SMOTETomek); Optuna-tuned XGBoost and LightGBM (40 trials each); and a diverse-base stacking ensemble (logistic regression, BRF, XGBoost, k-nearest neighbours and RBF-SVM) with logistic meta-learner. Models were evaluated by 5×5 repeated stratified cross-validation with bootstrap 95% confidence intervals on AUC, Brier score, calibration-in-the-large, calibration slope and intercept. Paired comparisons against BRF used the DeLong test. Firth penalized logistic regression on the deployable postoperative-B set was the pre-specified deployment model, chosen for calibration and interpretability rather than discrimination; BalancedRandomForest served only as the DeLong comparison anchor and was not a deployment candidate (poor calibration, Brier 0.228). All resampling, hyperparameter tuning and Platt recalibration were performed strictly within the training folds of the outer cross-validation; no test-fold data informed preprocessing or model selection.</w:t>
       </w:r>
     </w:p>
     <w:p>
@@ -807,7 +807,7 @@
           <w:i w:val="0"/>
           <w:sz w:val="22"/>
         </w:rPr>
-        <w:t xml:space="preserve"> We report empirical coverage, average prediction-set size, and the fractions of patients receiving confident singleton predictions.</w:t>
+        <w:t xml:space="preserve"> We report empirical coverage, average prediction-set size, and the fractions of patients receiving confident singleton predictions. Each prediction set maps to an explicit clinical action: a singleton {no-seizure} to observation (no AED), a singleton {seizure} to continuous EEG plus targeted AED, and the doubleton (abstention) to the default policy of universal AED. Because the doubleton-to-action choice is a policy lever, it is varied across three mappings (→ universal AED, → observation, → cEEG) in a sensitivity analysis (Supplementary Appendix S6).</w:t>
       </w:r>
     </w:p>
     <w:p>
@@ -892,7 +892,7 @@
           <w:i w:val="0"/>
           <w:sz w:val="22"/>
         </w:rPr>
-        <w:t xml:space="preserve"> Probabilistic sensitivity used 10,000 Monte Carlo iterations. Expected value of perfect information (EVPI) and per-parameter partial perfect information (EVPPI) were estimated by Strong–Oakley non-parametric regression on 5,000 PSA samples,</w:t>
+        <w:t xml:space="preserve"> Because cSDH-specific AED efficacy is unproven — no randomised trial exists and pooled observational estimates show no significant seizure reduction — the AED relative-risk reduction was modelled with a base case of no effect and an optimistic bound of 0.30, and the AED disutility across a 0.02–0.15 range; one-way and two-way sensitivity analyses on these two parameters are reported, together with UK (NICE) and Eurozone cost perspectives. The ML strategies act on the conformal partition described above. Probabilistic sensitivity used 10,000 Monte Carlo iterations. Expected value of perfect information (EVPI) and per-parameter partial perfect information (EVPPI) were estimated by Strong–Oakley non-parametric regression on 5,000 PSA samples,</w:t>
       </w:r>
       <w:r>
         <w:rPr>
@@ -1012,7 +1012,7 @@
           <w:i w:val="0"/>
           <w:sz w:val="22"/>
         </w:rPr>
-        <w:t>On BIDMC, Firth penalized logistic regression produced a 5 × 5 repeated cross-validated AUC of 0.681 (95% CI 0.609–0.753), within noise of the BalancedRandomForest reference (0.676; 0.595–0.760; DeLong p = 0.81). Removing three variables that could in principle be charted after seizure onset (postoperative-B) yielded AUC 0.645; the primary signal does not require post-event information. External validation in the eICU non-traumatic cohort gave AUC 0.750 (0.711–0.774); leave-one-hospital-out random-effects pooling across 42 hospitals yielded AUC 0.684 (0.651–0.714), with τ² ≈ 0 and I² = 0% (Figure 1).</w:t>
+        <w:t>On BIDMC, the deployable Firth model on the leakage-safe postoperative-B set produced a 5 × 5 repeated cross-validated AUC of 0.645. Adding the three peri-decision variables (postoperative-A) raised AUC to 0.681 (95% CI 0.609–0.753), within noise of the BalancedRandomForest reference (0.676; 0.595–0.760; DeLong p = 0.81); the gap between the deployable and non-deployable sets (0.036) lies within the Bernoulli noise floor at 48 events, so the deployable signal does not require peri-decision information. External validation in the eICU non-traumatic cohort gave AUC 0.750 (0.711–0.774); leave-one-hospital-out random-effects pooling across 42 hospitals yielded AUC 0.684 (0.651–0.714). Between-hospital heterogeneity was low on the variance-stabilising logit scale (τ² ≈ 0, I² = 0%); a raw-AUC sensitivity analysis gave higher estimates (I² up to ~56%), and the 95% prediction interval (Appendix S7) is reported as the honest summary of cross-site transportability (Figure 1).</w:t>
       </w:r>
     </w:p>
     <w:p>
@@ -1040,7 +1040,7 @@
           <w:i w:val="0"/>
           <w:sz w:val="22"/>
         </w:rPr>
-        <w:t>Pre-recalibration, class-rebalanced classifiers assigned probabilities that were too extreme (eICU Set C: Brier 0.071, calibration slope 1.51). Cross-validated Platt scaling brought slope to within 0.99–1.04 in every model and calibration-in-the-large to |CITL| ≤ 0.03 (Figure 2A). On decision-curve analysis (Figure 2B) the eICU Set C model showed positive net benefit across the 5–15% probability-threshold band — the range that brackets clinically reasonable thresholds for AED prophylaxis or selective monitoring. The BIDMC postoperative-A model achieved positive net benefit only at the lowest thresholds (below approximately 5%) and crossed below zero through the clinical threshold band, consistent with its more modest discrimination ceiling at n=48 events; the manuscript's clinical-deployment case for BIDMC therefore rests on the calibrated conformal layer (§3.4) rather than on raw decision-curve performance.</w:t>
+        <w:t>Calibration was assessed out-of-fold. For the deployable postoperative-B model, cross-validated Platt scaling achieved calibration-in-the-large near zero (|CITL| ≤ 0.01), low expected calibration error (ECE ≈ 0.034) and a low Brier score (0.068); the recalibration slope exceeded one (≈1.6–2.8 depending on the Platt protocol), indicating that predictions are under-dispersed — compressed toward the base rate — a direct consequence of the weak discrimination over a narrow probability range at 48 events rather than of miscalibration in the mean (Figure 2A; Supplementary Appendix S8). A FLIC/FLAC comparison (Appendix) confirmed that Firth's own intercept correction removes the mean bias but not the under-dispersion, which is why Platt recalibration is used at deployment. On decision-curve analysis (Figure 2B) the eICU Set C model showed positive net benefit across the 5–15% probability-threshold band — the range that brackets clinically reasonable thresholds for AED prophylaxis or selective monitoring. The BIDMC postoperative-A model achieved positive net benefit only at the lowest thresholds (below approximately 5%) and crossed below zero through the clinical threshold band, consistent with its more modest discrimination ceiling at n=48 events; the manuscript's clinical-deployment case for BIDMC therefore rests on the calibrated conformal layer (§3.4) rather than on raw decision-curve performance.</w:t>
       </w:r>
     </w:p>
     <w:p>
@@ -1143,7 +1143,7 @@
           <w:i w:val="0"/>
           <w:sz w:val="22"/>
         </w:rPr>
-        <w:t>Under base-case parameters refreshed from the 2021–2025 literature, ML-guided AED prophylaxis was the dominant strategy: lower expected cost ($4,365 vs $5,844 for observation, $5,362 for universal AED) and higher expected health (7.43 QALYs vs 7.36 and 7.42; Figure 5). ML-guided cEEG had higher expected cost ($7,685) and lower QALYs than ML-AED but remained cost-effective relative to observation in 62% of probabilistic samples at $100,000/QALY. This is, to our knowledge, the first value-of-information analysis applied to postoperative-seizure prophylaxis after cSDH evacuation. The per-patient expected value of perfect information at $100k/QALY was $541; the population-discounted value over 10 years and 40,000 operations per year was approximately $190 million. Strong–Oakley non-parametric regression identified per-day cEEG cost ($195 per patient EVPPI), baseline seizure prevalence ($127), AED relative-risk reduction ($96) and model sensitivity ($31) as the parameters with the largest decision-relevant information value (Figure 6).</w:t>
+        <w:t>At the deployable operating point — the calibrated base-rate threshold of 7.3% — the postoperative-B model had sensitivity 0.50 (95% CI 0.36–0.64), specificity 0.70 (0.66–0.74), positive predictive value 0.12 (0.07–0.16) and negative predictive value 0.95 (0.93–0.97). In the probabilistic cost-effectiveness analysis all three active strategies — universal AED, ML-guided AED and ML-guided cEEG — dominated watchful observation on expected net monetary benefit. The choice among the active strategies, however, was not resolved by the model alone: it turned on AED efficacy and AED harm in cSDH, both of which the evidence leaves uncertain. Under the optimistic, externally-imported base case (AED relative-risk reduction 0.45, negligible disutility) universal AED had the highest expected net benefit by a small margin (≈$1k on a ≈$641k base; ML-guided cEEG retained ~20% probability of being optimal). One-way sensitivity analysis showed AED efficacy (net-benefit swing ≈$4,300) and AED disutility (≈$2,100) dominated the decision: ML-guided allocation became the highest-net-benefit strategy once AED relative-risk reduction fell to ≤0.30 or AED disutility reached ≥0.10 — i.e. across the entire cSDH-plausible range, given that no cSDH study demonstrates a significant protective AED effect (Figure 5; Supplementary Appendix S6). The result was stable across the three conformal-to-action mappings and across US, UK (NICE) and Eurozone cost perspectives. This is, to our knowledge, the first value-of-information analysis applied to postoperative-seizure prophylaxis after cSDH; consistent with the sensitivity analysis, it ranked AED efficacy and AED harm as the parameters with the greatest decision-relevant information value (Figure 6).</w:t>
       </w:r>
     </w:p>
     <w:p>
@@ -1263,6 +1263,22 @@
           <w:sz w:val="22"/>
         </w:rPr>
         <w:t>One methodological observation bears on future cSDH research: cross-cohort transfer learning from eICU to BIDMC failed not for statistical reasons but because the underlying age-coefficient signs differ between mixed-acuity ICU SDH and pure post-craniotomy cSDH. Any future transfer-learning attempt in this domain must verify coefficient-sign agreement before adopting informative priors.</w:t>
+      </w:r>
+    </w:p>
+    <w:p>
+      <w:pPr>
+        <w:spacing w:line="360" w:lineRule="auto" w:after="120"/>
+        <w:ind w:firstLine="432"/>
+        <w:jc w:val="both"/>
+      </w:pPr>
+      <w:r>
+        <w:rPr>
+          <w:rFonts w:ascii="Times New Roman" w:hAnsi="Times New Roman"/>
+          <w:b w:val="0"/>
+          <w:i w:val="0"/>
+          <w:sz w:val="22"/>
+        </w:rPr>
+        <w:t>Relative to prior work, existing cSDH seizure studies are single-centre association analyses that report risk factors rather than a validated prediction model with discrimination metrics: Goertz and colleagues (n = 101) identified preoperative midline shift and membranectomy as independent predictors, and Hamou and colleagues (n = 349) identified depressed postoperative brain volume, but neither reported an AUC or external validation; radiomic seizure models with reported discrimination (e.g. AUC 0.82) exist for acute, not chronic, subdural haematoma and address a different disease entity. To our knowledge no externally validated, calibration-focused seizure-prediction model specific to chronic SDH has been published, which positions the present multi-database, conformal, decision-analytic approach as a methodological contribution rather than an incremental discrimination gain.</w:t>
       </w:r>
     </w:p>
     <w:p>
@@ -2490,7 +2506,7 @@
           <w:i/>
           <w:sz w:val="20"/>
         </w:rPr>
-        <w:t>Figure 3.  Eleven-method modelling battery on BIDMC postoperative-A. A — Cross-validated AUC with bootstrap 95% CIs across model classes converge near 0.68. B — Brier score across the same models. The Firth penalized logistic regression deployment model (rust) matches discrimination of every well-behaved alternative while delivering threefold-better calibration than BalancedRandomForest (navy).</w:t>
+        <w:t>Figure 3.  Eleven-method modelling battery on BIDMC postoperative-A. A — Cross-validated AUC with bootstrap 95% CIs across model classes converge near 0.68. The fifteen rows comprise the eleven model classes plus four configuration variants of methods already counted (Bayesian logistic regression under two priors; stacking with and without isotonic post-calibration), not additional model classes. B — Brier score across the same models. The Firth penalized logistic regression deployment model (rust) matches the discrimination of every well-behaved alternative while delivering threefold-better calibration than BalancedRandomForest (navy), which serves only as the DeLong comparison anchor.</w:t>
       </w:r>
     </w:p>
     <w:p>

</xml_diff>

<commit_message>
Phase 4: apply adversarial fixes F7-F13 to manuscript
F7: correct 'all active dominate observation' (only ML-guided does at low RRR); add
model-vs-random discrimination premium; conditional CEA. F9: conformal 22%/11%/11% (deployed
Firth). F10: VOI ~$23M, ML-guided preferred, no single pivotal param. F11: deployable->candidate.
F12: external evaluation in related population, demote 0.750, note 0.57-0.61 surgical strata.
F13: Brier 0.068, title calibration-focused, abstract prediction interval + slope caveat,
biological->sample-size limit, 8 supplementary figures.
</commit_message>
<xml_diff>
--- a/docs/main_manuscript.docx
+++ b/docs/main_manuscript.docx
@@ -12,7 +12,7 @@
           <w:b/>
           <w:sz w:val="30"/>
         </w:rPr>
-        <w:t>Postoperative seizure after chronic subdural haematoma evacuation: a calibrated, conformal-prediction proof-of-concept with multi-database validation and value-of-information analysis</w:t>
+        <w:t>Postoperative seizure after chronic subdural haematoma evacuation: a calibration-focused, conformal-prediction proof-of-concept with multi-database evaluation and value-of-information analysis</w:t>
       </w:r>
     </w:p>
     <w:p>
@@ -159,7 +159,7 @@
           <w:i w:val="0"/>
           <w:sz w:val="20"/>
         </w:rPr>
-        <w:t>Code and data availability:  The analysis code, six main figures, seven supplementary figures, the TRIPOD-AI reporting checklist (Supplementary Appendix S1), the reproducibility appendix (Supplementary Appendix S2) and the BIDMC feature dictionary (Supplementary Appendix S3) are openly available at github.com/nielspac177/csdh-postop-seizure-risk and permanently archived on Zenodo (DOI: [pending — minted at manuscript submission via the GitHub–Zenodo integration]). An interactive companion site at nielspac177.github.io/csdh-postop-seizure-risk provides a calibrated patient-level risk calculator, a population cost-savings tool, and an interactive code callgraph; all computation runs client-side in the browser so that no patient information is transmitted. Raw patient-level data are restricted by the BIDMC Institutional Review Board and the eICU Collaborative Research Database data-use agreement; filtered, de-identified working subsets are released to authorised peer reviewers via the reviewer-access protocol documented at github.com/nielspac177/csdh-postop-seizure-risk/tree/reviewer-access-template.</w:t>
+        <w:t>Code and data availability:  The analysis code, six main figures, eight supplementary figures, the TRIPOD-AI reporting checklist (Supplementary Appendix S1), the reproducibility appendix (Supplementary Appendix S2) and the BIDMC feature dictionary (Supplementary Appendix S3) are openly available at github.com/nielspac177/csdh-postop-seizure-risk and permanently archived on Zenodo (DOI: [pending — minted at manuscript submission via the GitHub–Zenodo integration]). An interactive companion site at nielspac177.github.io/csdh-postop-seizure-risk provides a calibrated patient-level risk calculator, a population cost-savings tool, and an interactive code callgraph; all computation runs client-side in the browser so that no patient information is transmitted. Raw patient-level data are restricted by the BIDMC Institutional Review Board and the eICU Collaborative Research Database data-use agreement; filtered, de-identified working subsets are released to authorised peer reviewers via the reviewer-access protocol documented at github.com/nielspac177/csdh-postop-seizure-risk/tree/reviewer-access-template.</w:t>
       </w:r>
     </w:p>
     <w:p>
@@ -239,7 +239,7 @@
           <w:i w:val="0"/>
           <w:sz w:val="22"/>
         </w:rPr>
-        <w:t>We developed and externally evaluated a machine-learning risk score for postoperative seizure in 655 cSDH evacuations at BIDMC (development; 48 events) and 3,297 non-traumatic subdural haematoma ICU stays across 42 hospitals in the eICU Collaborative Research Database (external validation; 300 seizures). Eleven model classes were compared, including six SMOTE-family oversamplers, Optuna-tuned XGBoost and LightGBM, a diverse-base stacking ensemble, Bayesian logistic regression with eICU-informed priors, and Firth penalized logistic regression. Class-conditional (Mondrian) conformal prediction provided individual-patient decision sets. A probabilistic cost-effectiveness analysis with value-of-information (VOI) was run on 10,000 Monte Carlo iterations.</w:t>
+        <w:t>We developed and externally evaluated a machine-learning risk score for postoperative seizure in 655 cSDH evacuations at BIDMC (development; 48 events) and 3,297 non-traumatic subdural haematoma ICU stays across 42 hospitals in the eICU Collaborative Research Database (external evaluation in a related population; 300 seizures). Eleven model classes were compared, including six SMOTE-family oversamplers, Optuna-tuned XGBoost and LightGBM, a diverse-base stacking ensemble, Bayesian logistic regression with eICU-informed priors, and Firth penalized logistic regression. Class-conditional (Mondrian) conformal prediction provided individual-patient decision sets. A probabilistic cost-effectiveness analysis with value-of-information (VOI) was run on 10,000 Monte Carlo iterations.</w:t>
       </w:r>
     </w:p>
     <w:p>
@@ -263,7 +263,7 @@
           <w:i w:val="0"/>
           <w:sz w:val="22"/>
         </w:rPr>
-        <w:t>Firth penalized logistic regression was the deployment model, fit on a leakage-safe postoperative-B feature set (18 variables available at the end of evacuation, before the AED/EEG decision); it discriminated at AUC 0.645. A postoperative-A set that additionally included three peri-decision variables reached AUC 0.681 (95% CI 0.609–0.753) but is not deployable, the difference lying within the Bernoulli noise floor at 48 events. Firth matched BalancedRandomForest discrimination (DeLong p = 0.81) with markedly better calibration (Brier 0.069 vs 0.228) and calibration-in-the-large near zero. Eleven model classes converged on an AUC ceiling near 0.68 consistent with 2022–2025 meta-evidence. eICU external AUC was 0.750 (0.711–0.774); random-effects pooled AUC across 42 hospitals was 0.684 (0.651–0.714). Class-conditional conformal prediction at α=0.10 gave confident singleton predictions in 37% of patients (rule-out 27%; rule-in 11%). All active prophylaxis strategies dominated observation; the choice between universal AED and ML-guided allocation depended on AED efficacy and harm — both uncertain in cSDH — with ML-guided allocation cost-effective under cSDH-plausible values. Value-of-information identified AED efficacy and AED harm as the dominant research priorities.</w:t>
+        <w:t>Firth penalized logistic regression was the candidate model, fit on a leakage-safe postoperative-B feature set (18 variables available at the end of evacuation, before the AED/EEG decision); it discriminated at AUC 0.645. A postoperative-A set that additionally included three peri-decision variables reached AUC 0.681 (95% CI 0.609–0.753) but is not deployable, the difference lying within the Bernoulli noise floor at 48 events. Firth matched BalancedRandomForest discrimination (DeLong p = 0.81) with markedly better calibration (Brier 0.068 vs 0.228) and calibration-in-the-large near zero, though predictions remained under-dispersed (recalibration slope &gt;1) given the narrow probability range at 48 events. Eleven model classes converged on an AUC ceiling near 0.68 consistent with 2022–2025 meta-evidence. In external evaluation on a related (mixed-acuity ICU) population, AUC was 0.750 (0.711–0.774); random-effects pooled AUC across 42 hospitals was 0.684 (prediction interval 0.53–0.95). Class-conditional conformal prediction at α=0.10 gave confident singleton predictions in 22% of patients (rule-out 11%; rule-in 11%). ML-guided allocation beat watchful observation and, at a matched treated fraction, beat random allocation (discrimination premium ≈$1,000–1,600/patient), confirming the model — not the treated fraction — added value. The choice between universal AED and ML-guided allocation depended on AED efficacy and harm in cSDH (both uncertain): under cSDH-plausible values ML-guided allocation had the highest expected net benefit, whereas universal AED was preferable only under optimistic, imported efficacy assumptions. Population value of perfect information at $100k/QALY was approximately $23M over 10 years.</w:t>
       </w:r>
     </w:p>
     <w:p>
@@ -492,7 +492,7 @@
           <w:i w:val="0"/>
           <w:sz w:val="22"/>
         </w:rPr>
-        <w:t>We undertook a proof-of-concept study to develop and externally validate a calibrated, parametric, deployable risk score for postoperative seizure after cSDH evacuation. The work integrates (i) an eleven-method modelling battery to characterise the discrimination ceiling, (ii) Firth penalized logistic regression as the deployment model on the basis of calibration, interpretability and valid coefficient confidence intervals, (iii) class-conditional conformal prediction for individual-patient decisions with distribution-free coverage guarantees, (iv) cost-effectiveness analysis with value-of-information scaling to the annual operative population, and (v) a documented transfer-learning failure between mixed-acuity intensive-care and pure operative cSDH cohorts.</w:t>
+        <w:t>We undertook a proof-of-concept study to develop and externally validate a calibrated, parametric risk score, computable at the intended decision point, for postoperative seizure after cSDH evacuation. The work integrates (i) an eleven-method modelling battery to characterise the discrimination ceiling, (ii) Firth penalized logistic regression as the candidate model on the basis of calibration, interpretability and valid coefficient confidence intervals, (iii) class-conditional conformal prediction for individual-patient decisions with distribution-free coverage guarantees, (iv) cost-effectiveness analysis with value-of-information scaling to the annual operative population, and (v) a documented transfer-learning failure between mixed-acuity intensive-care and pure operative cSDH cohorts.</w:t>
       </w:r>
     </w:p>
     <w:p>
@@ -647,7 +647,7 @@
           <w:i w:val="0"/>
           <w:sz w:val="22"/>
         </w:rPr>
-        <w:t>The primary outcome was any postoperative seizure within the index admission, ascertained from chart documentation at BIDMC and from the structured seizure flag in eICU; cross-database phenotype agreement supports the external-validity claim. Two feature sets were defined by their availability at the intended decision point — the end of haematoma evacuation, before the antiepileptic-drug/EEG decision. The deployable postoperative-B set comprised 18 demographic, operative and imaging-derived variables all available at that point. The postoperative-A set added three peri-decision variables (AED timing, proportion of stay on AED, abnormal EEG) that a clinician could not have at evacuation exit; because these encode information generated around or after the very decision the model is meant to inform, postoperative-A is reported only as a paired sensitivity comparison and is not deployable. The full feature dictionary is in Supplementary Appendix S3.</w:t>
+        <w:t>The primary outcome was any postoperative seizure within the index admission, ascertained from chart documentation at BIDMC and from the structured seizure flag in eICU; cross-database phenotype agreement supports the external-validity claim. Two feature sets were defined by their availability at the intended decision point — the end of haematoma evacuation, before the antiepileptic-drug/EEG decision. The leakage-safe postoperative-B set comprised 18 demographic, operative and imaging-derived variables all available at that point. The postoperative-A set added three peri-decision variables (AED timing, proportion of stay on AED, abnormal EEG) that a clinician could not have at evacuation exit; because these encode information generated around or after the very decision the model is meant to inform, postoperative-A is reported only as a paired sensitivity comparison and is not deployable. The full feature dictionary is in Supplementary Appendix S3.</w:t>
       </w:r>
     </w:p>
     <w:p>
@@ -675,7 +675,7 @@
           <w:i w:val="0"/>
           <w:sz w:val="22"/>
         </w:rPr>
-        <w:t>Eleven model classes were compared: the prior version's BalancedRandomForest (BRF) reference; Firth penalized logistic regression; Bayesian logistic regression with weakly-informative and eICU-informed priors; class-weighted RandomForest; six SMOTE-family oversampling variants (SMOTE, Borderline-SMOTE, SVM-SMOTE, ADASYN, SMOTEENN, SMOTETomek); Optuna-tuned XGBoost and LightGBM (40 trials each); and a diverse-base stacking ensemble (logistic regression, BRF, XGBoost, k-nearest neighbours and RBF-SVM) with logistic meta-learner. Models were evaluated by 5×5 repeated stratified cross-validation with bootstrap 95% confidence intervals on AUC, Brier score, calibration-in-the-large, calibration slope and intercept. Paired comparisons against BRF used the DeLong test. Firth penalized logistic regression on the deployable postoperative-B set was the pre-specified deployment model, chosen for calibration and interpretability rather than discrimination; BalancedRandomForest served only as the DeLong comparison anchor and was not a deployment candidate (poor calibration, Brier 0.228). All resampling, hyperparameter tuning and Platt recalibration were performed strictly within the training folds of the outer cross-validation; no test-fold data informed preprocessing or model selection.</w:t>
+        <w:t>Eleven model classes were compared: the prior version's BalancedRandomForest (BRF) reference; Firth penalized logistic regression; Bayesian logistic regression with weakly-informative and eICU-informed priors; class-weighted RandomForest; six SMOTE-family oversampling variants (SMOTE, Borderline-SMOTE, SVM-SMOTE, ADASYN, SMOTEENN, SMOTETomek); Optuna-tuned XGBoost and LightGBM (40 trials each); and a diverse-base stacking ensemble (logistic regression, BRF, XGBoost, k-nearest neighbours and RBF-SVM) with logistic meta-learner. Models were evaluated by 5×5 repeated stratified cross-validation with bootstrap 95% confidence intervals on AUC, Brier score, calibration-in-the-large, calibration slope and intercept. Paired comparisons against BRF used the DeLong test. Firth penalized logistic regression on the leakage-safe postoperative-B set was the pre-specified candidate model, chosen for calibration and interpretability rather than discrimination; BalancedRandomForest served only as the DeLong comparison anchor and was not a deployment candidate (poor calibration, Brier 0.228). All resampling, hyperparameter tuning and Platt recalibration were performed strictly within the training folds of the outer cross-validation; no test-fold data informed preprocessing or model selection.</w:t>
       </w:r>
     </w:p>
     <w:p>
@@ -1012,7 +1012,7 @@
           <w:i w:val="0"/>
           <w:sz w:val="22"/>
         </w:rPr>
-        <w:t>On BIDMC, the deployable Firth model on the leakage-safe postoperative-B set produced a 5 × 5 repeated cross-validated AUC of 0.645. Adding the three peri-decision variables (postoperative-A) raised AUC to 0.681 (95% CI 0.609–0.753), within noise of the BalancedRandomForest reference (0.676; 0.595–0.760; DeLong p = 0.81); the gap between the deployable and non-deployable sets (0.036) lies within the Bernoulli noise floor at 48 events, so the deployable signal does not require peri-decision information. External validation in the eICU non-traumatic cohort gave AUC 0.750 (0.711–0.774); leave-one-hospital-out random-effects pooling across 42 hospitals yielded AUC 0.684 (0.651–0.714). Between-hospital heterogeneity was low on the variance-stabilising logit scale (τ² ≈ 0, I² = 0%); a raw-AUC sensitivity analysis gave higher estimates (I² up to ~56%), and the 95% prediction interval (Appendix S7) is reported as the honest summary of cross-site transportability (Figure 1).</w:t>
+        <w:t>On BIDMC, the candidate Firth model on the leakage-safe postoperative-B set produced a 5 × 5 repeated cross-validated AUC of 0.645. Adding the three peri-decision variables (postoperative-A) raised AUC to 0.681 (95% CI 0.609–0.753), within noise of the BalancedRandomForest reference (0.676; 0.595–0.760; DeLong p = 0.81); the gap between the deployable and non-deployable sets (0.036) lies within the Bernoulli noise floor at 48 events, so the deployable signal does not require peri-decision information. External evaluation in the eICU non-traumatic cohort — a related, mixed-acuity ICU population rather than operatively-evacuated cSDH — gave AUC 0.750 (0.711–0.774), but discrimination fell to 0.57–0.61 in the strata most resembling surgical cSDH (Supplementary Table S2), so this figure reflects transportability to a broader population than the target indication; leave-one-hospital-out random-effects pooling across 42 hospitals yielded AUC 0.684 (0.651–0.714). Between-hospital heterogeneity was low on the variance-stabilising logit scale (τ² ≈ 0, I² = 0%); a raw-AUC sensitivity analysis gave higher estimates (I² up to ~56%), and the 95% prediction interval (Appendix S7) is reported as the honest summary of cross-site transportability (Figure 1).</w:t>
       </w:r>
     </w:p>
     <w:p>
@@ -1115,7 +1115,7 @@
           <w:i w:val="0"/>
           <w:sz w:val="22"/>
         </w:rPr>
-        <w:t>Class-conditional (Mondrian) conformal prediction sets tracked the target coverage within 0.3 percentage points across α ∈ {0.05, 0.10, 0.20} (empirical coverage 94.9%, 90.2% and 80.3% respectively). At α = 0.10 — corresponding to a 90% individual-patient coverage guarantee — the procedure produced a confident singleton prediction in 37% of patients: rule-out of seizure in 27% (AED-avoidance candidates) and rule-in in 11% (intensive-monitoring candidates). The remaining 63% of patients were explicitly deferred to clinical judgment with a two-class prediction set (Figure 4).</w:t>
+        <w:t>On the deployed Firth postoperative-B model, class-conditional (Mondrian) conformal prediction achieved class-conditional coverage close to target at α = 0.10 (90.3% for the no-seizure class, 93.8% for the seizure class). At this level the procedure produced a confident singleton prediction in 22% of patients: rule-out of seizure in 11% (AED-avoidance candidates) and rule-in in 11% (intensive-monitoring candidates). The remaining 78% were explicitly deferred to clinical judgment with a two-class prediction set (Figure 4). The deployed model abstains more often than the BalancedRandomForest reference because its calibrated probabilities occupy a narrow range — a conservative, honest behaviour for a weak-signal rare outcome.</w:t>
       </w:r>
     </w:p>
     <w:p>
@@ -1143,7 +1143,7 @@
           <w:i w:val="0"/>
           <w:sz w:val="22"/>
         </w:rPr>
-        <w:t>At the deployable operating point — the calibrated base-rate threshold of 7.3% — the postoperative-B model had sensitivity 0.50 (95% CI 0.36–0.64), specificity 0.70 (0.66–0.74), positive predictive value 0.12 (0.07–0.16) and negative predictive value 0.95 (0.93–0.97). In the probabilistic cost-effectiveness analysis all three active strategies — universal AED, ML-guided AED and ML-guided cEEG — dominated watchful observation on expected net monetary benefit. The choice among the active strategies, however, was not resolved by the model alone: it turned on AED efficacy and AED harm in cSDH, both of which the evidence leaves uncertain. Under the optimistic, externally-imported base case (AED relative-risk reduction 0.45, negligible disutility) universal AED had the highest expected net benefit by a small margin (≈$1k on a ≈$641k base; ML-guided cEEG retained ~20% probability of being optimal). One-way sensitivity analysis showed AED efficacy (net-benefit swing ≈$4,300) and AED disutility (≈$2,100) dominated the decision: ML-guided allocation became the highest-net-benefit strategy once AED relative-risk reduction fell to ≤0.30 or AED disutility reached ≥0.10 — i.e. across the entire cSDH-plausible range, given that no cSDH study demonstrates a significant protective AED effect (Figure 5; Supplementary Appendix S6). The result was stable across the three conformal-to-action mappings and across US, UK (NICE) and Eurozone cost perspectives. This is, to our knowledge, the first value-of-information analysis applied to postoperative-seizure prophylaxis after cSDH; consistent with the sensitivity analysis, it ranked AED efficacy and AED harm as the parameters with the greatest decision-relevant information value (Figure 6).</w:t>
+        <w:t>At the candidate operating point — the calibrated base-rate threshold of 7.3% — the postoperative-B model had sensitivity 0.50 (95% CI 0.36–0.64), specificity 0.70 (0.66–0.74), positive predictive value 0.12 (0.07–0.16) and negative predictive value 0.95 (0.93–0.97). The optimal strategy depended on AED efficacy and AED harm in cSDH, both of which the evidence leaves uncertain. Under the optimistic, externally-imported reference (AED relative-risk reduction 0.45, negligible disutility) universal AED had the highest expected net benefit by a small margin (≈$1k on a ≈$641k base). When AED efficacy was set to the cSDH-plausible range (no study demonstrates a significant protective effect), the ranking changed: ML-guided allocation had the highest expected net benefit once the relative-risk reduction fell to ≤0.30 or AED disutility reached ≥0.10. Crucially, the advantage of ML-guided allocation was not merely a consequence of treating fewer patients: against a no-information policy that treated the same fraction at random, the model retained a positive discrimination premium of ≈$1,000–1,600 per patient across all efficacy scenarios, confirming that the model's discrimination — not its treated fraction — created the value. ML-guided allocation also exceeded watchful observation at every efficacy value (universal AED, by contrast, fell below observation once AED efficacy approached zero, because a harmful, ineffective drug given to everyone is worse than treating no-one). The ordering was stable across the three conformal-to-action mappings and across US, UK (NICE) and Eurozone cost perspectives (Figure 5; Supplementary Appendix S6). In a value-of-information analysis recomputed under the deployable model and cSDH-grounded AED priors — to our knowledge the first applied to this question — ML-guided allocation was preferred in expectation and the population expected value of perfect information at $100k/QALY was approximately $23M over 10 years; no single parameter individually reversed the decision within its prior range, while the deterministic sensitivity analysis identified AED efficacy and AED harm as the parameters governing the universal-versus-selective comparison (Figure 6).</w:t>
       </w:r>
     </w:p>
     <w:p>
@@ -1230,7 +1230,7 @@
           <w:i w:val="0"/>
           <w:sz w:val="22"/>
         </w:rPr>
-        <w:t xml:space="preserve"> The Bernoulli noise floor on 48 events places the 95% CI half-width on AUC ≈ 0.70 near 0.06; the ceiling we observe is therefore biological, not algorithmic.</w:t>
+        <w:t xml:space="preserve"> The Bernoulli noise floor on 48 events places the 95% CI half-width on AUC ≈ 0.70 near 0.06; the ceiling we observe is therefore consistent with a sample-size and measured-feature limit rather than an algorithmic one — whether a higher ceiling exists cannot be settled from 48 events without the imaging covariates the structured record lacks.</w:t>
       </w:r>
     </w:p>
     <w:p>
@@ -1246,7 +1246,7 @@
           <w:i w:val="0"/>
           <w:sz w:val="22"/>
         </w:rPr>
-        <w:t>The decision-analytic integration clarifies where the calibrated model could change practice. All active prophylaxis strategies (universal AED, ML-guided AED, ML-guided cEEG) dominated watchful observation. The choice among the active strategies, however, is not settled by the model alone: it depends on two cSDH-specific parameters that the evidence leaves genuinely uncertain — the efficacy of AED prophylaxis (no randomised trial exists, and pooled observational estimates show no significant seizure reduction) and its disutility in elderly patients (falls, sedation, cognition). One-way sensitivity analysis at $100k/QALY shows AED efficacy and AED harm dominate the decision: under cSDH-plausible values (AED relative-risk reduction at or below 0.30, or a non-trivial AED disutility) ML-guided allocation has the highest expected net benefit, whereas universal AED is preferable only under the optimistic, externally-imported assumptions of strong efficacy and negligible harm. The accompanying value-of-information analysis — to our knowledge the first applied to this question — accordingly ranks AED efficacy and AED harm as the priority targets for prospective data collection.</w:t>
+        <w:t>The decision-analytic integration clarifies where the calibrated model could change practice. The choice among strategies is not settled by the model alone: it depends on two cSDH-specific parameters that the evidence leaves genuinely uncertain — the efficacy of AED prophylaxis (no randomised trial exists, and pooled observational estimates, including our own, show no significant seizure reduction) and its disutility in elderly patients (falls, sedation, cognition). Under cSDH-plausible values (relative-risk reduction ≤0.30 or non-trivial disutility) ML-guided allocation had the highest expected net benefit; universal AED was preferable only under optimistic imported assumptions of strong efficacy and negligible harm, and indeed fell below watchful observation once AED efficacy approached zero (a harmful, ineffective drug given to all is worse than treating none). Importantly, the value of ML-guided allocation did not reduce to treating fewer patients: against a no-information rule treating the same fraction at random, the model retained a positive discrimination premium (≈$1,000–1,600/patient), so the gain reflects the model's discrimination rather than its treated fraction. Value-of-information recomputed under the deployable model and cSDH-grounded priors — the first applied to this question — found ML-guided allocation preferred in expectation with a modest population expected value of perfect information (~$23M over 10 years), and identified AED efficacy and AED harm as the parameters governing the universal-versus-selective choice and thus the priorities for prospective data collection.</w:t>
       </w:r>
     </w:p>
     <w:p>
@@ -1294,7 +1294,7 @@
           <w:i w:val="0"/>
           <w:sz w:val="22"/>
         </w:rPr>
-        <w:t>This study has limitations. The development cohort is single-institution, partly mitigated by external evaluation across 42 eICU hospitals with low logit-scale between-site heterogeneity. Calibration-in-the-large and decision-curve net benefit are the robust calibration findings; the recalibration slope exceeds one (under-dispersed predictions), reflecting weak discrimination over a narrow probability range at 48 events. The structured electronic medical record lacks imaging features known to inform seizure risk (sulcal effacement, midline shift magnitude, density heterogeneity); future work could augment the deployment model with imaging-derived covariates extracted from radiology free-text or directly from CT scans. Outcome ascertainment is administrative rather than EEG-adjudicated; sensitivity analyses across four time-window cuts preserved the primary AUC. Cost inputs adopt the US-payer perspective; the VOI analysis explicitly identifies per-day cEEG cost as the highest-EVPPI parameter for international refinement.</w:t>
+        <w:t>This study has limitations. The development cohort is single-institution, partly mitigated by external evaluation across 42 eICU hospitals with low logit-scale between-site heterogeneity. Calibration-in-the-large and decision-curve net benefit are the robust calibration findings; the recalibration slope exceeds one (under-dispersed predictions), reflecting weak discrimination over a narrow probability range at 48 events. The structured electronic medical record lacks imaging features known to inform seizure risk (sulcal effacement, midline shift magnitude, density heterogeneity); future work could augment the candidate model with imaging-derived covariates extracted from radiology free-text or directly from CT scans. Outcome ascertainment is administrative rather than EEG-adjudicated; sensitivity analyses across four time-window cuts preserved the primary AUC. Cost inputs adopt the US-payer perspective; the VOI analysis explicitly identifies per-day cEEG cost as the highest-EVPPI parameter for international refinement.</w:t>
       </w:r>
     </w:p>
     <w:p>
@@ -2506,7 +2506,7 @@
           <w:i/>
           <w:sz w:val="20"/>
         </w:rPr>
-        <w:t>Figure 3.  Eleven-method modelling battery on BIDMC postoperative-A. A — Cross-validated AUC with bootstrap 95% CIs across model classes converge near 0.68. The fifteen rows comprise the eleven model classes plus four configuration variants of methods already counted (Bayesian logistic regression under two priors; stacking with and without isotonic post-calibration), not additional model classes. B — Brier score across the same models. The Firth penalized logistic regression deployment model (rust) matches the discrimination of every well-behaved alternative while delivering threefold-better calibration than BalancedRandomForest (navy), which serves only as the DeLong comparison anchor.</w:t>
+        <w:t>Figure 3.  Eleven-method modelling battery on BIDMC postoperative-A. A — Cross-validated AUC with bootstrap 95% CIs across model classes converge near 0.68. The fifteen rows comprise the eleven model classes plus four configuration variants of methods already counted (Bayesian logistic regression under two priors; stacking with and without isotonic post-calibration), not additional model classes. B — Brier score across the same models. The Firth penalized logistic regression candidate model (rust) matches the discrimination of every well-behaved alternative while delivering threefold-better calibration than BalancedRandomForest (navy), which serves only as the DeLong comparison anchor.</w:t>
       </w:r>
     </w:p>
     <w:p>
@@ -2572,7 +2572,7 @@
           <w:i/>
           <w:sz w:val="20"/>
         </w:rPr>
-        <w:t>Figure 4.  Class-conditional conformal prediction. A — Empirical coverage tracks the target 1−α across α ∈ {0.05, 0.10, 0.20}. B — Rule-out and rule-in singleton fractions versus α; at α = 0.10 the procedure delivers confident decisions for 37% of patients (rule-out 27%, rule-in 11%).</w:t>
+        <w:t>Figure 4.  Class-conditional conformal prediction on the deployed Firth postoperative-B model. A — Empirical class-conditional coverage near the target 1−α across α ∈ {0.05, 0.10, 0.20}. B — Rule-out and rule-in singleton fractions versus α; at α = 0.10 the procedure delivers confident decisions for 22% of patients (rule-out 11%, rule-in 11%).</w:t>
       </w:r>
     </w:p>
     <w:p>

</xml_diff>

<commit_message>
Phase 4 round-2: Brier 0.068, conclusion honesty (model modest VOI; framework is contribution); log residuals F14-F19
</commit_message>
<xml_diff>
--- a/docs/main_manuscript.docx
+++ b/docs/main_manuscript.docx
@@ -1087,7 +1087,7 @@
           <w:i w:val="0"/>
           <w:sz w:val="22"/>
         </w:rPr>
-        <w:t xml:space="preserve"> Calibration, by contrast, varied substantially across methods: Brier score ranged from 0.067 (Firth and stacking) to 0.228 (BalancedRandomForest) — a more-than-threefold difference (Figure 3). Bayesian regression with eICU-informed priors significantly degraded discrimination (AUC 0.515, DeLong p = 0.001) because the eICU age coefficient is negative in mixed-acuity ICU SDH while pure post-craniotomy cSDH shows a positive age effect — a biological mismatch warning for any future transfer-learning between these populations.</w:t>
+        <w:t xml:space="preserve"> Calibration, by contrast, varied substantially across methods: Brier score ranged from 0.068 (Firth, the candidate model) to 0.228 (BalancedRandomForest) — a more-than-threefold difference (Figure 3). Bayesian regression with eICU-informed priors significantly degraded discrimination (AUC 0.515, DeLong p = 0.001) because the eICU age coefficient is negative in mixed-acuity ICU SDH while pure post-craniotomy cSDH shows a positive age effect — a biological mismatch warning for any future transfer-learning between these populations.</w:t>
       </w:r>
     </w:p>
     <w:p>
@@ -1310,7 +1310,7 @@
           <w:i w:val="0"/>
           <w:sz w:val="22"/>
         </w:rPr>
-        <w:t>In conclusion, calibrated machine-learning prediction of postoperative seizure after cSDH evacuation, paired with class-conditional conformal prediction, is feasible and meets methodological preconditions for prospective evaluation, supporting individual-patient decisions with formal coverage guarantees. Active prophylaxis dominates watchful observation; whether to allocate it selectively with the model rather than treat all patients depends on AED efficacy and harm in cSDH, which current evidence leaves uncertain, and which value-of-information identifies as the priority targets for future research.</w:t>
+        <w:t>In conclusion, calibrated machine-learning prediction of postoperative seizure after cSDH evacuation, paired with class-conditional conformal prediction, is feasible and meets methodological preconditions for prospective evaluation, supporting individual-patient decisions, for the minority of patients in whom the conformal procedure yields a confident prediction, with formal coverage guarantees. ML-guided allocation exceeds watchful observation; whether to allocate prophylaxis selectively with the model rather than treat all or none depends on AED efficacy and harm in cSDH, which current evidence leaves uncertain. Consistent with this, the value-of-information analysis shows the model's discrimination carries modest decision value relative to AED efficacy and per-day cEEG cost; the methodological contribution is the calibration-and-conformal decision framework, and the priority for prospective work is resolving the AED and monitoring parameters.</w:t>
       </w:r>
     </w:p>
     <w:p>

</xml_diff>

<commit_message>
Humanizing pass: remove 97 em-dashes (-> commas) and hollow openers (Importantly/Crucially)
Reduces AI-texture in the prose per the-humanizer review; numbers, citations, en-dash
ranges and all claims preserved. Manuscript rebuilt clean.
</commit_message>
<xml_diff>
--- a/docs/main_manuscript.docx
+++ b/docs/main_manuscript.docx
@@ -159,7 +159,7 @@
           <w:i w:val="0"/>
           <w:sz w:val="20"/>
         </w:rPr>
-        <w:t>Code and data availability:  The analysis code, six main figures, eight supplementary figures, the TRIPOD-AI reporting checklist (Supplementary Appendix S1), the reproducibility appendix (Supplementary Appendix S2) and the BIDMC feature dictionary (Supplementary Appendix S3) are openly available at github.com/nielspac177/csdh-postop-seizure-risk and permanently archived on Zenodo (DOI: [pending — minted at manuscript submission via the GitHub–Zenodo integration]). An interactive companion site at nielspac177.github.io/csdh-postop-seizure-risk provides a calibrated patient-level risk calculator, a population cost-savings tool, and an interactive code callgraph; all computation runs client-side in the browser so that no patient information is transmitted. Raw patient-level data are restricted by the BIDMC Institutional Review Board and the eICU Collaborative Research Database data-use agreement; filtered, de-identified working subsets are released to authorised peer reviewers via the reviewer-access protocol documented at github.com/nielspac177/csdh-postop-seizure-risk/tree/reviewer-access-template.</w:t>
+        <w:t>Code and data availability:  The analysis code, six main figures, eight supplementary figures, the TRIPOD-AI reporting checklist (Supplementary Appendix S1), the reproducibility appendix (Supplementary Appendix S2) and the BIDMC feature dictionary (Supplementary Appendix S3) are openly available at github.com/nielspac177/csdh-postop-seizure-risk and permanently archived on Zenodo (DOI: [pending, minted at manuscript submission via the GitHub–Zenodo integration]). An interactive companion site at nielspac177.github.io/csdh-postop-seizure-risk provides a calibrated patient-level risk calculator, a population cost-savings tool, and an interactive code callgraph; all computation runs client-side in the browser so that no patient information is transmitted. Raw patient-level data are restricted by the BIDMC Institutional Review Board and the eICU Collaborative Research Database data-use agreement; filtered, de-identified working subsets are released to authorised peer reviewers via the reviewer-access protocol documented at github.com/nielspac177/csdh-postop-seizure-risk/tree/reviewer-access-template.</w:t>
       </w:r>
     </w:p>
     <w:p>
@@ -263,7 +263,7 @@
           <w:i w:val="0"/>
           <w:sz w:val="22"/>
         </w:rPr>
-        <w:t>Firth penalized logistic regression was the candidate model, fit on a leakage-safe postoperative-B feature set (18 variables available at the end of evacuation, before the AED/EEG decision); it discriminated at AUC 0.645. A postoperative-A set that additionally included three peri-decision variables reached AUC 0.681 (95% CI 0.609–0.753) but is not deployable, the difference lying within the Bernoulli noise floor at 48 events. Firth matched BalancedRandomForest discrimination (DeLong p = 0.81) with markedly better calibration (Brier 0.068 vs 0.228) and calibration-in-the-large near zero, though predictions remained under-dispersed (recalibration slope &gt;1) given the narrow probability range at 48 events. Eleven model classes converged on an AUC ceiling near 0.68 consistent with 2022–2025 meta-evidence. In external evaluation on a related (mixed-acuity ICU) population, AUC was 0.750 (0.711–0.774); random-effects pooled AUC across 42 hospitals was 0.684 (prediction interval 0.53–0.95). Class-conditional conformal prediction at α=0.10 gave confident singleton predictions in 22% of patients (rule-out 11%; rule-in 11%). ML-guided allocation beat watchful observation and, at a matched treated fraction, beat random allocation (discrimination premium ≈$1,000–1,600/patient), confirming the model — not the treated fraction — added value. The choice between universal AED and ML-guided allocation depended on AED efficacy and harm in cSDH (both uncertain): under cSDH-plausible values ML-guided allocation had the highest expected net benefit, whereas universal AED was preferable only under optimistic, imported efficacy assumptions. Population value of perfect information at $100k/QALY was approximately $23M over 10 years.</w:t>
+        <w:t>Firth penalized logistic regression was the candidate model, fit on a leakage-safe postoperative-B feature set (18 variables available at the end of evacuation, before the AED/EEG decision); it discriminated at AUC 0.645. A postoperative-A set that additionally included three peri-decision variables reached AUC 0.681 (95% CI 0.609–0.753) but is not deployable, the difference lying within the Bernoulli noise floor at 48 events. Firth matched BalancedRandomForest discrimination (DeLong p = 0.81) with markedly better calibration (Brier 0.068 vs 0.228) and calibration-in-the-large near zero, though predictions remained under-dispersed (recalibration slope &gt;1) given the narrow probability range at 48 events. Eleven model classes converged on an AUC ceiling near 0.68 consistent with 2022–2025 meta-evidence. In external evaluation on a related (mixed-acuity ICU) population, AUC was 0.750 (0.711–0.774); random-effects pooled AUC across 42 hospitals was 0.684 (prediction interval 0.53–0.95). Class-conditional conformal prediction at α=0.10 gave confident singleton predictions in 22% of patients (rule-out 11%; rule-in 11%). ML-guided allocation beat watchful observation and, at a matched treated fraction, beat random allocation (discrimination premium ≈$1,000–1,600/patient), confirming the model, not the treated fraction, added value. The choice between universal AED and ML-guided allocation depended on AED efficacy and harm in cSDH (both uncertain): under cSDH-plausible values ML-guided allocation had the highest expected net benefit, whereas universal AED was preferable only under optimistic, imported efficacy assumptions. Population value of perfect information at $100k/QALY was approximately $23M over 10 years.</w:t>
       </w:r>
     </w:p>
     <w:p>
@@ -287,7 +287,7 @@
           <w:i w:val="0"/>
           <w:sz w:val="22"/>
         </w:rPr>
-        <w:t>For postoperative seizure after cSDH evacuation, optimising small-cohort clinical machine learning for calibration and individual-patient decision support — rather than discrimination — yields a candidate model that meets methodological preconditions for prospective clinical evaluation. Whether selective ML-guided prophylaxis is preferable to treating all or none hinges on AED efficacy and harm in cSDH, which current evidence leaves uncertain; value-of-information prioritises resolving these.</w:t>
+        <w:t>For postoperative seizure after cSDH evacuation, optimising small-cohort clinical machine learning for calibration and individual-patient decision support, rather than discrimination, yields a candidate model that meets methodological preconditions for prospective clinical evaluation. Whether selective ML-guided prophylaxis is preferable to treating all or none hinges on AED efficacy and harm in cSDH, which current evidence leaves uncertain; value-of-information prioritises resolving these.</w:t>
       </w:r>
     </w:p>
     <w:p>
@@ -365,7 +365,7 @@
           <w:i w:val="0"/>
           <w:sz w:val="22"/>
         </w:rPr>
-        <w:t>Routine prophylactic antiepileptic drug (AED) administration is controversial. Levetiracetam — the most commonly used agent — carries specific harms in the elderly: neuropsychiatric adverse events in roughly 15–20% of users, somnolence in approximately 28%, and a relative risk of falls of 1.6–1.8.</w:t>
+        <w:t>Routine prophylactic antiepileptic drug (AED) administration is controversial. Levetiracetam, the most commonly used agent, carries specific harms in the elderly: neuropsychiatric adverse events in roughly 15–20% of users, somnolence in approximately 28%, and a relative risk of falls of 1.6–1.8.</w:t>
       </w:r>
       <w:r>
         <w:rPr>
@@ -527,7 +527,7 @@
           <w:i w:val="0"/>
           <w:sz w:val="22"/>
         </w:rPr>
-        <w:t xml:space="preserve"> — supplying a principled "I do not know" signal at the bedside, applied as a post-hoc wrapper that leaves the underlying Firth model untouched. This combination of calibration, conformal decision support and value-of-information has not, to our knowledge, been applied to postoperative seizure prediction.</w:t>
+        <w:t>, supplying a principled "I do not know" signal at the bedside, applied as a post-hoc wrapper that leaves the underlying Firth model untouched. This combination of calibration, conformal decision support and value-of-information has not, to our knowledge, been applied to postoperative seizure prediction.</w:t>
       </w:r>
     </w:p>
     <w:p>
@@ -619,7 +619,7 @@
           <w:i w:val="0"/>
           <w:sz w:val="22"/>
         </w:rPr>
-        <w:t>The BIDMC development cohort comprised all consecutive patients undergoing burr-hole or craniotomy for cSDH between January 2010 and December 2023 (n = 655; 48 in-admission postoperative seizures). For external evaluation, the eICU Collaborative Research Database was screened in stages: 5,376 ICU stays with any subdural haematoma diagnosis across 139 hospitals were identified, from which the pre-specified primary stratum — non-traumatic SDH stays at hospitals contributing ≥10 such stays — yielded 3,297 stays across 42 hospitals (300 seizures). All headline external figures, including the leave-one-hospital-out pooling, use this 3,297/42 primary stratum; the broader 5,376/139 screen and three alternative cohort definitions are reported as sensitivity analyses in the Supplement, and a CONSORT-style inclusion-flow diagram (Supplementary Appendix S8) details every exclusion step.</w:t>
+        <w:t>The BIDMC development cohort comprised all consecutive patients undergoing burr-hole or craniotomy for cSDH between January 2010 and December 2023 (n = 655; 48 in-admission postoperative seizures). For external evaluation, the eICU Collaborative Research Database was screened in stages: 5,376 ICU stays with any subdural haematoma diagnosis across 139 hospitals were identified, from which the pre-specified primary stratum, non-traumatic SDH stays at hospitals contributing ≥10 such stays, yielded 3,297 stays across 42 hospitals (300 seizures). All headline external figures, including the leave-one-hospital-out pooling, use this 3,297/42 primary stratum; the broader 5,376/139 screen and three alternative cohort definitions are reported as sensitivity analyses in the Supplement, and a CONSORT-style inclusion-flow diagram (Supplementary Appendix S8) details every exclusion step.</w:t>
       </w:r>
     </w:p>
     <w:p>
@@ -647,7 +647,7 @@
           <w:i w:val="0"/>
           <w:sz w:val="22"/>
         </w:rPr>
-        <w:t>The primary outcome was any postoperative seizure within the index admission, ascertained from chart documentation at BIDMC and from the structured seizure flag in eICU; cross-database phenotype agreement supports the external-validity claim. Two feature sets were defined by their availability at the intended decision point — the end of haematoma evacuation, before the antiepileptic-drug/EEG decision. The leakage-safe postoperative-B set comprised 18 demographic, operative and imaging-derived variables all available at that point. The postoperative-A set added three peri-decision variables (AED timing, proportion of stay on AED, abnormal EEG) that a clinician could not have at evacuation exit; because these encode information generated around or after the very decision the model is meant to inform, postoperative-A is reported only as a paired sensitivity comparison and is not deployable. The full feature dictionary is in Supplementary Appendix S3.</w:t>
+        <w:t>The primary outcome was any postoperative seizure within the index admission, ascertained from chart documentation at BIDMC and from the structured seizure flag in eICU; cross-database phenotype agreement supports the external-validity claim. Two feature sets were defined by their availability at the intended decision point, the end of haematoma evacuation, before the antiepileptic-drug/EEG decision. The leakage-safe postoperative-B set comprised 18 demographic, operative and imaging-derived variables all available at that point. The postoperative-A set added three peri-decision variables (AED timing, proportion of stay on AED, abnormal EEG) that a clinician could not have at evacuation exit; because these encode information generated around or after the very decision the model is meant to inform, postoperative-A is reported only as a paired sensitivity comparison and is not deployable. The full feature dictionary is in Supplementary Appendix S3.</w:t>
       </w:r>
     </w:p>
     <w:p>
@@ -769,7 +769,7 @@
           <w:i w:val="0"/>
           <w:sz w:val="22"/>
         </w:rPr>
-        <w:t xml:space="preserve"> The Mondrian variant calibrates the nonconformity quantile separately for each true class, so that coverage on the rare positive class is guaranteed and cannot be satisfied by always covering the majority class — a property neither probability calibration nor naive bootstrap CIs offer on imbalanced data.</w:t>
+        <w:t xml:space="preserve"> The Mondrian variant calibrates the nonconformity quantile separately for each true class, so that coverage on the rare positive class is guaranteed and cannot be satisfied by always covering the majority class, a property neither probability calibration nor naive bootstrap CIs offer on imbalanced data.</w:t>
       </w:r>
       <w:r>
         <w:rPr>
@@ -788,7 +788,7 @@
           <w:i w:val="0"/>
           <w:sz w:val="22"/>
         </w:rPr>
-        <w:t xml:space="preserve"> The resulting prediction set is adaptive: it shrinks to a singleton {'no seizure'} or {'seizure'} for patients the model can confidently classify (rule-out or rule-in) and expands to a doubleton {seizure, no seizure} for ambiguous patients — supplying the deployment with a principled abstention signal.</w:t>
+        <w:t xml:space="preserve"> The resulting prediction set is adaptive: it shrinks to a singleton {'no seizure'} or {'seizure'} for patients the model can confidently classify (rule-out or rule-in) and expands to a doubleton {seizure, no seizure} for ambiguous patients, supplying the deployment with a principled abstention signal.</w:t>
       </w:r>
       <w:r>
         <w:rPr>
@@ -892,7 +892,7 @@
           <w:i w:val="0"/>
           <w:sz w:val="22"/>
         </w:rPr>
-        <w:t xml:space="preserve"> Because cSDH-specific AED efficacy is unproven — no randomised trial exists and pooled observational estimates show no significant seizure reduction — the AED relative-risk reduction was anchored at an imported base case of 0.45 (post-traumatic/tumour literature) purely as an optimistic reference, with the cSDH-plausible range of 0–0.30 and the AED disutility (0.02–0.15) explored in one-way and two-way sensitivity analyses, alongside UK (NICE) and Eurozone cost perspectives. The ML strategies act on the conformal partition described above. Probabilistic sensitivity used 10,000 Monte Carlo iterations. Expected value of perfect information (EVPI) and per-parameter partial perfect information (EVPPI) were estimated by Strong–Oakley non-parametric regression on 5,000 PSA samples,</w:t>
+        <w:t xml:space="preserve"> Because cSDH-specific AED efficacy is unproven, no randomised trial exists and pooled observational estimates show no significant seizure reduction, the AED relative-risk reduction was anchored at an imported base case of 0.45 (post-traumatic/tumour literature) purely as an optimistic reference, with the cSDH-plausible range of 0–0.30 and the AED disutility (0.02–0.15) explored in one-way and two-way sensitivity analyses, alongside UK (NICE) and Eurozone cost perspectives. The ML strategies act on the conformal partition described above. Probabilistic sensitivity used 10,000 Monte Carlo iterations. Expected value of perfect information (EVPI) and per-parameter partial perfect information (EVPPI) were estimated by Strong–Oakley non-parametric regression on 5,000 PSA samples,</w:t>
       </w:r>
       <w:r>
         <w:rPr>
@@ -1012,7 +1012,7 @@
           <w:i w:val="0"/>
           <w:sz w:val="22"/>
         </w:rPr>
-        <w:t>On BIDMC, the candidate Firth model on the leakage-safe postoperative-B set produced a 5 × 5 repeated cross-validated AUC of 0.645. Adding the three peri-decision variables (postoperative-A) raised AUC to 0.681 (95% CI 0.609–0.753), within noise of the BalancedRandomForest reference (0.676; 0.595–0.760; DeLong p = 0.81); the gap between the deployable and non-deployable sets (0.036) lies within the Bernoulli noise floor at 48 events, so the deployable signal does not require peri-decision information. External evaluation in the eICU non-traumatic cohort — a related, mixed-acuity ICU population rather than operatively-evacuated cSDH — gave AUC 0.750 (0.711–0.774), but discrimination fell to 0.57–0.61 in the strata most resembling surgical cSDH (Supplementary Table S2), so this figure reflects transportability to a broader population than the target indication; leave-one-hospital-out random-effects pooling across 42 hospitals yielded AUC 0.684 (0.651–0.714). Between-hospital heterogeneity was low on the variance-stabilising logit scale (τ² ≈ 0, I² = 0%); a raw-AUC sensitivity analysis gave higher estimates (I² up to ~56%), and the 95% prediction interval (Appendix S7) is reported as the honest summary of cross-site transportability (Figure 1).</w:t>
+        <w:t>On BIDMC, the candidate Firth model on the leakage-safe postoperative-B set produced a 5 × 5 repeated cross-validated AUC of 0.645. Adding the three peri-decision variables (postoperative-A) raised AUC to 0.681 (95% CI 0.609–0.753), within noise of the BalancedRandomForest reference (0.676; 0.595–0.760; DeLong p = 0.81); the gap between the deployable and non-deployable sets (0.036) lies within the Bernoulli noise floor at 48 events, so the deployable signal does not require peri-decision information. External evaluation in the eICU non-traumatic cohort, a related, mixed-acuity ICU population rather than operatively-evacuated cSDH, gave AUC 0.750 (0.711–0.774), but discrimination fell to 0.57–0.61 in the strata most resembling surgical cSDH (Supplementary Table S2), so this figure reflects transportability to a broader population than the target indication; leave-one-hospital-out random-effects pooling across 42 hospitals yielded AUC 0.684 (0.651–0.714). Between-hospital heterogeneity was low on the variance-stabilising logit scale (τ² ≈ 0, I² = 0%); a raw-AUC sensitivity analysis gave higher estimates (I² up to ~56%), and the 95% prediction interval (Appendix S7) is reported as the honest summary of cross-site transportability (Figure 1).</w:t>
       </w:r>
     </w:p>
     <w:p>
@@ -1040,7 +1040,7 @@
           <w:i w:val="0"/>
           <w:sz w:val="22"/>
         </w:rPr>
-        <w:t>Calibration was assessed out-of-fold. For the deployable postoperative-B model, cross-validated Platt scaling achieved calibration-in-the-large near zero (|CITL| ≤ 0.01), low expected calibration error (ECE ≈ 0.034) and a low Brier score (0.068); the recalibration slope exceeded one (≈1.6–2.8 depending on the Platt protocol), indicating that predictions are under-dispersed — compressed toward the base rate — a direct consequence of the weak discrimination over a narrow probability range at 48 events rather than of miscalibration in the mean (Figure 2A; Supplementary Appendix S8). A FLIC/FLAC comparison (Appendix) confirmed that Firth's own intercept correction removes the mean bias but not the under-dispersion, which is why Platt recalibration is used at deployment. On decision-curve analysis (Figure 2B) the eICU Set C model showed positive net benefit across the 5–15% probability-threshold band — the range that brackets clinically reasonable thresholds for AED prophylaxis or selective monitoring. The BIDMC postoperative-A model achieved positive net benefit only at the lowest thresholds (below approximately 5%) and crossed below zero through the clinical threshold band, consistent with its more modest discrimination ceiling at n=48 events; the manuscript's clinical-deployment case for BIDMC therefore rests on the calibrated conformal layer (§3.4) rather than on raw decision-curve performance.</w:t>
+        <w:t>Calibration was assessed out-of-fold. For the deployable postoperative-B model, cross-validated Platt scaling achieved calibration-in-the-large near zero (|CITL| ≤ 0.01), low expected calibration error (ECE ≈ 0.034) and a low Brier score (0.068); the recalibration slope exceeded one (≈1.6–2.8 depending on the Platt protocol), indicating that predictions are under-dispersed, compressed toward the base rate, a direct consequence of the weak discrimination over a narrow probability range at 48 events rather than of miscalibration in the mean (Figure 2A; Supplementary Appendix S8). A FLIC/FLAC comparison (Appendix) confirmed that Firth's own intercept correction removes the mean bias but not the under-dispersion, which is why Platt recalibration is used at deployment. On decision-curve analysis (Figure 2B) the eICU Set C model showed positive net benefit across the 5–15% probability-threshold band, the range that brackets clinically reasonable thresholds for AED prophylaxis or selective monitoring. The BIDMC postoperative-A model achieved positive net benefit only at the lowest thresholds (below approximately 5%) and crossed below zero through the clinical threshold band, consistent with its more modest discrimination ceiling at n=48 events; the manuscript's clinical-deployment case for BIDMC therefore rests on the calibrated conformal layer (§3.4) rather than on raw decision-curve performance.</w:t>
       </w:r>
     </w:p>
     <w:p>
@@ -1087,7 +1087,7 @@
           <w:i w:val="0"/>
           <w:sz w:val="22"/>
         </w:rPr>
-        <w:t xml:space="preserve"> Calibration, by contrast, varied substantially across methods: Brier score ranged from 0.068 (Firth, the candidate model) to 0.228 (BalancedRandomForest) — a more-than-threefold difference (Figure 3). Bayesian regression with eICU-informed priors significantly degraded discrimination (AUC 0.515, DeLong p = 0.001) because the eICU age coefficient is negative in mixed-acuity ICU SDH while pure post-craniotomy cSDH shows a positive age effect — a biological mismatch warning for any future transfer-learning between these populations.</w:t>
+        <w:t xml:space="preserve"> Calibration, by contrast, varied substantially across methods: Brier score ranged from 0.068 (Firth, the candidate model) to 0.228 (BalancedRandomForest), a more-than-threefold difference (Figure 3). Bayesian regression with eICU-informed priors significantly degraded discrimination (AUC 0.515, DeLong p = 0.001) because the eICU age coefficient is negative in mixed-acuity ICU SDH while pure post-craniotomy cSDH shows a positive age effect, a biological mismatch warning for any future transfer-learning between these populations.</w:t>
       </w:r>
     </w:p>
     <w:p>
@@ -1115,7 +1115,7 @@
           <w:i w:val="0"/>
           <w:sz w:val="22"/>
         </w:rPr>
-        <w:t>On the candidate Firth postoperative-B model, class-conditional (Mondrian) conformal prediction achieved class-conditional coverage close to target at α = 0.10 (90.3% for the no-seizure class, 93.8% for the seizure class). At this level the procedure produced a confident singleton prediction in 22% of patients: rule-out of seizure in 11% (AED-avoidance candidates) and rule-in in 11% (intensive-monitoring candidates). The remaining 78% were explicitly deferred to clinical judgment with a two-class prediction set (Figure 4). The candidate model abstains more often than the BalancedRandomForest reference because its calibrated probabilities occupy a narrow range — a conservative, honest behaviour for a weak-signal rare outcome.</w:t>
+        <w:t>On the candidate Firth postoperative-B model, class-conditional (Mondrian) conformal prediction achieved class-conditional coverage close to target at α = 0.10 (90.3% for the no-seizure class, 93.8% for the seizure class). At this level the procedure produced a confident singleton prediction in 22% of patients: rule-out of seizure in 11% (AED-avoidance candidates) and rule-in in 11% (intensive-monitoring candidates). The remaining 78% were explicitly deferred to clinical judgment with a two-class prediction set (Figure 4). The candidate model abstains more often than the BalancedRandomForest reference because its calibrated probabilities occupy a narrow range, a conservative, honest behaviour for a weak-signal rare outcome.</w:t>
       </w:r>
     </w:p>
     <w:p>
@@ -1143,7 +1143,7 @@
           <w:i w:val="0"/>
           <w:sz w:val="22"/>
         </w:rPr>
-        <w:t>At the candidate operating point — the calibrated base-rate threshold of 7.3% — the postoperative-B model had sensitivity 0.50 (95% CI 0.36–0.64), specificity 0.70 (0.66–0.74), positive predictive value 0.12 (0.07–0.16) and negative predictive value 0.95 (0.93–0.97). The optimal strategy depended on AED efficacy and AED harm in cSDH, both of which the evidence leaves uncertain. Under the optimistic, externally-imported reference (AED relative-risk reduction 0.45, negligible disutility) universal AED had the highest expected net benefit by a small margin (≈$1k on a ≈$641k base). When AED efficacy was set to the cSDH-plausible range (no study demonstrates a significant protective effect), the ranking changed: ML-guided allocation had the highest expected net benefit once the relative-risk reduction fell to ≤0.30 or AED disutility reached ≥0.10. Crucially, the advantage of ML-guided allocation was not merely a consequence of treating fewer patients: against a no-information policy that treated the same fraction at random, the model retained a positive discrimination premium of ≈$1,000–1,600 per patient across all efficacy scenarios, confirming that the model's discrimination — not its treated fraction — created the value. ML-guided allocation also exceeded watchful observation at every efficacy value (universal AED, by contrast, fell below observation once AED efficacy approached zero, because a harmful, ineffective drug given to everyone is worse than treating no-one). The ordering was stable across the three conformal-to-action mappings and across US, UK (NICE) and Eurozone cost perspectives (Figure 5; Supplementary Appendix S6). In a value-of-information analysis recomputed under the deployable model and cSDH-grounded AED priors — to our knowledge the first applied to this question — ML-guided allocation was preferred in expectation and the population expected value of perfect information at $100k/QALY was approximately $23M over 10 years; no single parameter individually reversed the decision within its prior range, while the deterministic sensitivity analysis identified AED efficacy and AED harm as the parameters governing the universal-versus-selective comparison (Figure 6).</w:t>
+        <w:t>At the candidate operating point, the calibrated base-rate threshold of 7.3%, the postoperative-B model had sensitivity 0.50 (95% CI 0.36–0.64), specificity 0.70 (0.66–0.74), positive predictive value 0.12 (0.07–0.16) and negative predictive value 0.95 (0.93–0.97). The optimal strategy depended on AED efficacy and AED harm in cSDH, both of which the evidence leaves uncertain. Under the optimistic, externally-imported reference (AED relative-risk reduction 0.45, negligible disutility) universal AED had the highest expected net benefit by a small margin (≈$1k on a ≈$641k base). When AED efficacy was set to the cSDH-plausible range (no study demonstrates a significant protective effect), the ranking changed: ML-guided allocation had the highest expected net benefit once the relative-risk reduction fell to ≤0.30 or AED disutility reached ≥0.10. The advantage of ML-guided allocation was not merely a consequence of treating fewer patients: against a no-information policy that treated the same fraction at random, the model retained a positive discrimination premium of ≈$1,000–1,600 per patient across all efficacy scenarios, confirming that the model's discrimination, not its treated fraction, created the value. ML-guided allocation also exceeded watchful observation at every efficacy value (universal AED, by contrast, fell below observation once AED efficacy approached zero, because a harmful, ineffective drug given to everyone is worse than treating no-one). The ordering was stable across the three conformal-to-action mappings and across US, UK (NICE) and Eurozone cost perspectives (Figure 5; Supplementary Appendix S6). In a value-of-information analysis recomputed under the deployable model and cSDH-grounded AED priors, to our knowledge the first applied to this question, ML-guided allocation was preferred in expectation and the population expected value of perfect information at $100k/QALY was approximately $23M over 10 years; no single parameter individually reversed the decision within its prior range, while the deterministic sensitivity analysis identified AED efficacy and AED harm as the parameters governing the universal-versus-selective comparison (Figure 6).</w:t>
       </w:r>
     </w:p>
     <w:p>
@@ -1176,7 +1176,7 @@
           <w:i w:val="0"/>
           <w:sz w:val="22"/>
         </w:rPr>
-        <w:t>This proof-of-concept study shows that, for postoperative seizure after cSDH evacuation, optimising small-cohort clinical machine learning for calibration and individual-patient decision support — rather than discrimination — yields a candidate model that meets methodological preconditions for prospective clinical evaluation. Firth penalized logistic regression matches BalancedRandomForest on AUC, delivers three-fold better calibration, and supports class-conditional conformal prediction sets that confidently rule out seizure in approximately one quarter of patients at a 90% coverage guarantee. External evaluation across BIDMC and the eICU Collaborative Research Database showed low between-hospital heterogeneity on the variance-stabilising logit scale (I² = 0%); a raw-AUC sensitivity analysis gave higher estimates (I² up to ~56%), so we report the random-effects prediction interval (Appendix S7) as the more honest summary of cross-site transportability.</w:t>
+        <w:t>This proof-of-concept study shows that, for postoperative seizure after cSDH evacuation, optimising small-cohort clinical machine learning for calibration and individual-patient decision support, rather than discrimination, yields a candidate model that meets methodological preconditions for prospective clinical evaluation. Firth penalized logistic regression matches BalancedRandomForest on AUC, delivers three-fold better calibration, and supports class-conditional conformal prediction sets that confidently rule out seizure in approximately one quarter of patients at a 90% coverage guarantee. External evaluation across BIDMC and the eICU Collaborative Research Database showed low between-hospital heterogeneity on the variance-stabilising logit scale (I² = 0%); a raw-AUC sensitivity analysis gave higher estimates (I² up to ~56%), so we report the random-effects prediction interval (Appendix S7) as the more honest summary of cross-site transportability.</w:t>
       </w:r>
     </w:p>
     <w:p>
@@ -1192,7 +1192,7 @@
           <w:i w:val="0"/>
           <w:sz w:val="22"/>
         </w:rPr>
-        <w:t>The eleven-method modelling battery — spanning six SMOTE-family oversamplers, Optuna-tuned gradient boosting, diverse-base stacking, and Bayesian regression with multiple prior specifications — produced no statistically significant discrimination improvement over BalancedRandomForest. This null result is concordant with three independent 2022–2025 meta-analyses showing that class-imbalance corrections do not raise AUC in clinical risk models,</w:t>
+        <w:t>The eleven-method modelling battery, spanning six SMOTE-family oversamplers, Optuna-tuned gradient boosting, diverse-base stacking, and Bayesian regression with multiple prior specifications, produced no statistically significant discrimination improvement over BalancedRandomForest. This null result is concordant with three independent 2022–2025 meta-analyses showing that class-imbalance corrections do not raise AUC in clinical risk models,</w:t>
       </w:r>
       <w:r>
         <w:rPr>
@@ -1230,7 +1230,7 @@
           <w:i w:val="0"/>
           <w:sz w:val="22"/>
         </w:rPr>
-        <w:t xml:space="preserve"> The Bernoulli noise floor on 48 events places the 95% CI half-width on AUC ≈ 0.70 near 0.06; the ceiling we observe is therefore consistent with a sample-size and measured-feature limit rather than an algorithmic one — whether a higher ceiling exists cannot be settled from 48 events without the imaging covariates the structured record lacks.</w:t>
+        <w:t xml:space="preserve"> The Bernoulli noise floor on 48 events places the 95% CI half-width on AUC ≈ 0.70 near 0.06; the ceiling we observe is therefore consistent with a sample-size and measured-feature limit rather than an algorithmic one, whether a higher ceiling exists cannot be settled from 48 events without the imaging covariates the structured record lacks.</w:t>
       </w:r>
     </w:p>
     <w:p>
@@ -1246,7 +1246,7 @@
           <w:i w:val="0"/>
           <w:sz w:val="22"/>
         </w:rPr>
-        <w:t>The decision-analytic integration clarifies where the calibrated model could change practice. The choice among strategies is not settled by the model alone: it depends on two cSDH-specific parameters that the evidence leaves genuinely uncertain — the efficacy of AED prophylaxis (no randomised trial exists, and pooled observational estimates, including our own, show no significant seizure reduction) and its disutility in elderly patients (falls, sedation, cognition). Under cSDH-plausible values (relative-risk reduction ≤0.30 or non-trivial disutility) ML-guided allocation had the highest expected net benefit; universal AED was preferable only under optimistic imported assumptions of strong efficacy and negligible harm, and indeed fell below watchful observation once AED efficacy approached zero (a harmful, ineffective drug given to all is worse than treating none). Importantly, the value of ML-guided allocation did not reduce to treating fewer patients: against a no-information rule treating the same fraction at random, the model retained a positive discrimination premium (≈$1,000–1,600/patient), so the gain reflects the model's discrimination rather than its treated fraction. Value-of-information recomputed under the deployable model and cSDH-grounded priors — the first applied to this question — found ML-guided allocation preferred in expectation with a modest population expected value of perfect information (~$23M over 10 years), and identified AED efficacy and AED harm as the parameters governing the universal-versus-selective choice and thus the priorities for prospective data collection.</w:t>
+        <w:t>The decision-analytic integration clarifies where the calibrated model could change practice. The choice among strategies is not settled by the model alone: it depends on two cSDH-specific parameters that the evidence leaves genuinely uncertain, the efficacy of AED prophylaxis (no randomised trial exists, and pooled observational estimates, including our own, show no significant seizure reduction) and its disutility in elderly patients (falls, sedation, cognition). Under cSDH-plausible values (relative-risk reduction ≤0.30 or non-trivial disutility) ML-guided allocation had the highest expected net benefit; universal AED was preferable only under optimistic imported assumptions of strong efficacy and negligible harm, and indeed fell below watchful observation once AED efficacy approached zero (a harmful, ineffective drug given to all is worse than treating none). The value of ML-guided allocation did not reduce to treating fewer patients: against a no-information rule treating the same fraction at random, the model retained a positive discrimination premium (≈$1,000–1,600/patient), so the gain reflects the model's discrimination rather than its treated fraction. Value-of-information recomputed under the deployable model and cSDH-grounded priors, the first applied to this question, found ML-guided allocation preferred in expectation with a modest population expected value of perfect information (~$23M over 10 years), and identified AED efficacy and AED harm as the parameters governing the universal-versus-selective choice and thus the priorities for prospective data collection.</w:t>
       </w:r>
     </w:p>
     <w:p>
@@ -1627,7 +1627,7 @@
           <w:rFonts w:ascii="Times New Roman" w:hAnsi="Times New Roman"/>
           <w:sz w:val="20"/>
         </w:rPr>
-        <w:t>25. Neumann PJ, Cohen JT, Weinstein MC. Updating cost-effectiveness — the curious resilience of the $50,000-per-QALY threshold. N Engl J Med. 2014;371:796–7.</w:t>
+        <w:t>25. Neumann PJ, Cohen JT, Weinstein MC. Updating cost-effectiveness, the curious resilience of the $50,000-per-QALY threshold. N Engl J Med. 2014;371:796–7.</w:t>
       </w:r>
     </w:p>
     <w:p>
@@ -2161,7 +2161,7 @@
                 <w:rFonts w:ascii="Times New Roman" w:hAnsi="Times New Roman"/>
                 <w:sz w:val="20"/>
               </w:rPr>
-              <w:t>—</w:t>
+              <w:t xml:space="preserve">, </w:t>
             </w:r>
           </w:p>
         </w:tc>
@@ -2205,7 +2205,7 @@
                 <w:rFonts w:ascii="Times New Roman" w:hAnsi="Times New Roman"/>
                 <w:sz w:val="20"/>
               </w:rPr>
-              <w:t>—</w:t>
+              <w:t xml:space="preserve">, </w:t>
             </w:r>
           </w:p>
         </w:tc>
@@ -2374,7 +2374,7 @@
           <w:i/>
           <w:sz w:val="20"/>
         </w:rPr>
-        <w:t>Figure 1.  Multi-database discrimination. A — BIDMC primary cohort: Firth penalized logistic regression and BalancedRandomForest with bootstrap 95% CIs. B — eICU leave-one-hospital-out random-effects pooled estimates (DerSimonian–Laird) across cohort × feature-set combinations. C — Temporal-leakage audit: the strict pre-seizure feature subset (green) preserves discrimination in the full eICU cohort.</w:t>
+        <w:t>Figure 1.  Multi-database discrimination. A, BIDMC primary cohort: Firth penalized logistic regression and BalancedRandomForest with bootstrap 95% CIs. B, eICU leave-one-hospital-out random-effects pooled estimates (DerSimonian–Laird) across cohort × feature-set combinations. C, Temporal-leakage audit: the strict pre-seizure feature subset (green) preserves discrimination in the full eICU cohort.</w:t>
       </w:r>
     </w:p>
     <w:p>
@@ -2440,7 +2440,7 @@
           <w:i/>
           <w:sz w:val="20"/>
         </w:rPr>
-        <w:t>Figure 2.  Calibration and clinical utility. A — Calibration after Platt scaling, with bootstrap 95% CIs on per-bin observed event rates. B — Decision-curve net benefit across probability thresholds; the model outperforms 'treat all' and 'treat none' in the clinically relevant 5–15% band.</w:t>
+        <w:t>Figure 2.  Calibration and clinical utility. A, Calibration after Platt scaling, with bootstrap 95% CIs on per-bin observed event rates. B, Decision-curve net benefit across probability thresholds; the model outperforms 'treat all' and 'treat none' in the clinically relevant 5–15% band.</w:t>
       </w:r>
     </w:p>
     <w:p>
@@ -2506,7 +2506,7 @@
           <w:i/>
           <w:sz w:val="20"/>
         </w:rPr>
-        <w:t>Figure 3.  Eleven-method modelling battery on BIDMC postoperative-A. A — Cross-validated AUC with bootstrap 95% CIs across model classes converge near 0.68. The fifteen rows comprise the eleven model classes plus four configuration variants of methods already counted (Bayesian logistic regression under two priors; stacking with and without isotonic post-calibration), not additional model classes. B — Brier score across the same models. The Firth penalized logistic regression candidate model (rust) matches the discrimination of every well-behaved alternative while delivering threefold-better calibration than BalancedRandomForest (navy), which serves only as the DeLong comparison anchor.</w:t>
+        <w:t>Figure 3.  Eleven-method modelling battery on BIDMC postoperative-A. A, Cross-validated AUC with bootstrap 95% CIs across model classes converge near 0.68. The fifteen rows comprise the eleven model classes plus four configuration variants of methods already counted (Bayesian logistic regression under two priors; stacking with and without isotonic post-calibration), not additional model classes. B, Brier score across the same models. The Firth penalized logistic regression candidate model (rust) matches the discrimination of every well-behaved alternative while delivering threefold-better calibration than BalancedRandomForest (navy), which serves only as the DeLong comparison anchor.</w:t>
       </w:r>
     </w:p>
     <w:p>
@@ -2572,7 +2572,7 @@
           <w:i/>
           <w:sz w:val="20"/>
         </w:rPr>
-        <w:t>Figure 4.  Class-conditional conformal prediction on the candidate Firth postoperative-B model. A — Empirical class-conditional coverage near the target 1−α across α ∈ {0.05, 0.10, 0.20}. B — Rule-out and rule-in singleton fractions versus α; at α = 0.10 the procedure delivers confident decisions for 22% of patients (rule-out 11%, rule-in 11%).</w:t>
+        <w:t>Figure 4.  Class-conditional conformal prediction on the candidate Firth postoperative-B model. A, Empirical class-conditional coverage near the target 1−α across α ∈ {0.05, 0.10, 0.20}. B, Rule-out and rule-in singleton fractions versus α; at α = 0.10 the procedure delivers confident decisions for 22% of patients (rule-out 11%, rule-in 11%).</w:t>
       </w:r>
     </w:p>
     <w:p>
@@ -2638,7 +2638,7 @@
           <w:i/>
           <w:sz w:val="20"/>
         </w:rPr>
-        <w:t>Figure 5.  Cost-effectiveness analysis. A — Decision tree with base-case rollback per strategy. B — Cost-effectiveness plane from 10,000-iteration probabilistic sensitivity. C — Cost-effectiveness acceptability curves over willingness-to-pay.</w:t>
+        <w:t>Figure 5.  Cost-effectiveness analysis. A, Decision tree with base-case rollback per strategy. B, Cost-effectiveness plane from 10,000-iteration probabilistic sensitivity. C, Cost-effectiveness acceptability curves over willingness-to-pay.</w:t>
       </w:r>
     </w:p>
     <w:p>
@@ -2704,7 +2704,7 @@
           <w:i/>
           <w:sz w:val="20"/>
         </w:rPr>
-        <w:t>Figure 6.  Value of information. A — Per-parameter EVPPI tornado at WTP $100,000/QALY; the four highlighted parameters define the research-priority frontier. B — Per-patient EVPI as a function of willingness-to-pay threshold.</w:t>
+        <w:t>Figure 6.  Value of information. A, Per-parameter EVPPI tornado at WTP $100,000/QALY; the four highlighted parameters define the research-priority frontier. B, Per-patient EVPI as a function of willingness-to-pay threshold.</w:t>
       </w:r>
     </w:p>
     <w:p>

</xml_diff>

<commit_message>
Manuscript: real prior-predictor + AED-efficacy citations, keywords, funding/ethics/contrib statements, PI scale consistency (N1)
- Replace placeholder refs 14-16 with Hamou 2022 / Goertz 2019 / Guranda 2025 (cited in related work)
- Append AED-efficacy refs 43-46 (Pacheco-Barrios 2024, Nachiappan 2021, Ratilal Cochrane, Lavergne 2019), cited at AED-unproven claim
- Add Keywords (5); Funding, Conflicts, Author contributions, Ethics (IRB fill-in), Data availability statements
- Abstract prediction interval labelled by scale (logit I2=0%; raw-scale PI 0.53-0.95); refs 42->46
</commit_message>
<xml_diff>
--- a/docs/main_manuscript.docx
+++ b/docs/main_manuscript.docx
@@ -129,7 +129,31 @@
           <w:i w:val="0"/>
           <w:sz w:val="20"/>
         </w:rPr>
-        <w:t>Word count, abstract: 250 · main text: ~4,050 · Figures: 6 · Tables: 1 · Supplementary: yes · References: 42</w:t>
+        <w:t>Word count, abstract: 250 · main text: ~4,050 · Figures: 6 · Tables: 1 · Supplementary: yes · References: 46</w:t>
+      </w:r>
+    </w:p>
+    <w:p>
+      <w:pPr>
+        <w:spacing w:line="360" w:lineRule="auto" w:after="120"/>
+        <w:jc w:val="both"/>
+      </w:pPr>
+      <w:r>
+        <w:rPr>
+          <w:rFonts w:ascii="Times New Roman" w:hAnsi="Times New Roman"/>
+          <w:b/>
+          <w:i w:val="0"/>
+          <w:sz w:val="22"/>
+        </w:rPr>
+        <w:t xml:space="preserve">Keywords: </w:t>
+      </w:r>
+      <w:r>
+        <w:rPr>
+          <w:rFonts w:ascii="Times New Roman" w:hAnsi="Times New Roman"/>
+          <w:b w:val="0"/>
+          <w:i w:val="0"/>
+          <w:sz w:val="22"/>
+        </w:rPr>
+        <w:t>chronic subdural haematoma; postoperative seizure; clinical prediction model; conformal prediction; cost-effectiveness and value-of-information analysis</w:t>
       </w:r>
     </w:p>
     <w:p>
@@ -174,7 +198,67 @@
           <w:i w:val="0"/>
           <w:sz w:val="20"/>
         </w:rPr>
-        <w:t>Conflicts: None.</w:t>
+        <w:t>Funding: This study received no specific grant from any funding agency in the public, commercial or not-for-profit sectors.</w:t>
+      </w:r>
+    </w:p>
+    <w:p>
+      <w:pPr>
+        <w:spacing w:line="360" w:lineRule="auto" w:after="120"/>
+        <w:jc w:val="both"/>
+      </w:pPr>
+      <w:r>
+        <w:rPr>
+          <w:rFonts w:ascii="Times New Roman" w:hAnsi="Times New Roman"/>
+          <w:b w:val="0"/>
+          <w:i w:val="0"/>
+          <w:sz w:val="20"/>
+        </w:rPr>
+        <w:t>Conflicts of interest: None declared.</w:t>
+      </w:r>
+    </w:p>
+    <w:p>
+      <w:pPr>
+        <w:spacing w:line="360" w:lineRule="auto" w:after="120"/>
+        <w:jc w:val="both"/>
+      </w:pPr>
+      <w:r>
+        <w:rPr>
+          <w:rFonts w:ascii="Times New Roman" w:hAnsi="Times New Roman"/>
+          <w:b w:val="0"/>
+          <w:i w:val="0"/>
+          <w:sz w:val="20"/>
+        </w:rPr>
+        <w:t>Author contributions: N.P.-B. is the sole author and was responsible for study conception and design, data curation, analysis, interpretation, and drafting and revising the manuscript.</w:t>
+      </w:r>
+    </w:p>
+    <w:p>
+      <w:pPr>
+        <w:spacing w:line="360" w:lineRule="auto" w:after="120"/>
+        <w:jc w:val="both"/>
+      </w:pPr>
+      <w:r>
+        <w:rPr>
+          <w:rFonts w:ascii="Times New Roman" w:hAnsi="Times New Roman"/>
+          <w:b w:val="0"/>
+          <w:i w:val="0"/>
+          <w:sz w:val="20"/>
+        </w:rPr>
+        <w:t>Ethics: Approved by the Beth Israel Deaconess Medical Center Institutional Review Board (Protocol [IRB number to be inserted]); the eICU Collaborative Research Database v2.0 was accessed under its data-use agreement.</w:t>
+      </w:r>
+    </w:p>
+    <w:p>
+      <w:pPr>
+        <w:spacing w:line="360" w:lineRule="auto" w:after="120"/>
+        <w:jc w:val="both"/>
+      </w:pPr>
+      <w:r>
+        <w:rPr>
+          <w:rFonts w:ascii="Times New Roman" w:hAnsi="Times New Roman"/>
+          <w:b w:val="0"/>
+          <w:i w:val="0"/>
+          <w:sz w:val="20"/>
+        </w:rPr>
+        <w:t>Data availability: Analysis code, figures, the TRIPOD-AI checklist and aggregate results are openly available at github.com/nielspac177/csdh-postop-seizure-risk and archived on Zenodo (DOI to be minted at acceptance). Patient-level data are restricted by the BIDMC IRB and the eICU data-use agreement; filtered de-identified subsets are available to authorised reviewers via the documented reviewer-access protocol.</w:t>
       </w:r>
     </w:p>
     <w:p>
@@ -263,7 +347,7 @@
           <w:i w:val="0"/>
           <w:sz w:val="22"/>
         </w:rPr>
-        <w:t>Firth penalized logistic regression was the candidate model, fit on a leakage-safe postoperative-B feature set (18 variables available at the end of evacuation, before the AED/EEG decision); it discriminated at AUC 0.645. A postoperative-A set that additionally included three peri-decision variables reached AUC 0.681 (95% CI 0.609–0.753) but is not deployable, the difference lying within the Bernoulli noise floor at 48 events. Firth matched BalancedRandomForest discrimination (DeLong p = 0.81) with markedly better calibration (Brier 0.068 vs 0.228) and calibration-in-the-large near zero, though predictions remained under-dispersed (recalibration slope &gt;1) given the narrow probability range at 48 events. Eleven model classes converged on an AUC ceiling near 0.68 consistent with 2022–2025 meta-evidence. In external evaluation on a related (mixed-acuity ICU) population, AUC was 0.750 (0.711–0.774); random-effects pooled AUC across 42 hospitals was 0.684 (prediction interval 0.53–0.95). Class-conditional conformal prediction at α=0.10 gave confident singleton predictions in 22% of patients (rule-out 11%; rule-in 11%). ML-guided allocation beat watchful observation and, at a matched treated fraction, beat random allocation (discrimination premium ≈$1,000–1,600/patient), confirming the model, not the treated fraction, added value. The choice between universal AED and ML-guided allocation depended on AED efficacy and harm in cSDH (both uncertain): under cSDH-plausible values ML-guided allocation had the highest expected net benefit, whereas universal AED was preferable only under optimistic, imported efficacy assumptions. Population value of perfect information at $100k/QALY was approximately $23M over 10 years.</w:t>
+        <w:t>Firth penalized logistic regression was the candidate model, fit on a leakage-safe postoperative-B feature set (18 variables available at the end of evacuation, before the AED/EEG decision); it discriminated at AUC 0.645. A postoperative-A set that additionally included three peri-decision variables reached AUC 0.681 (95% CI 0.609–0.753) but is not deployable, the difference lying within the Bernoulli noise floor at 48 events. Firth matched BalancedRandomForest discrimination (DeLong p = 0.81) with markedly better calibration (Brier 0.068 vs 0.228) and calibration-in-the-large near zero, though predictions remained under-dispersed (recalibration slope &gt;1) given the narrow probability range at 48 events. Eleven model classes converged on an AUC ceiling near 0.68 consistent with 2022–2025 meta-evidence. In external evaluation on a related (mixed-acuity ICU) population, AUC was 0.750 (0.711–0.774); random-effects pooled AUC across 42 hospitals was 0.684 (95% CI 0.651–0.714; logit-scale I²=0%, raw-scale 95% prediction interval 0.53–0.95). Class-conditional conformal prediction at α=0.10 gave confident singleton predictions in 22% of patients (rule-out 11%; rule-in 11%). ML-guided allocation beat watchful observation and, at a matched treated fraction, beat random allocation (discrimination premium ≈$1,000–1,600/patient), confirming the model, not the treated fraction, added value. The choice between universal AED and ML-guided allocation depended on AED efficacy and harm in cSDH (both uncertain): under cSDH-plausible values ML-guided allocation had the highest expected net benefit, whereas universal AED was preferable only under optimistic, imported efficacy assumptions. Population value of perfect information at $100k/QALY was approximately $23M over 10 years.</w:t>
       </w:r>
     </w:p>
     <w:p>
@@ -591,7 +675,7 @@
           <w:i w:val="0"/>
           <w:sz w:val="22"/>
         </w:rPr>
-        <w:t xml:space="preserve"> The BIDMC analysis was approved by the institutional review board (Protocol 2024P000XXX); the eICU Collaborative Research Database v2.0 was accessed under its data-use agreement.</w:t>
+        <w:t xml:space="preserve"> The BIDMC analysis was approved by the institutional review board (Protocol [IRB number to be inserted]); the eICU Collaborative Research Database v2.0 was accessed under its data-use agreement.</w:t>
       </w:r>
     </w:p>
     <w:p>
@@ -1246,7 +1330,26 @@
           <w:i w:val="0"/>
           <w:sz w:val="22"/>
         </w:rPr>
-        <w:t>The decision-analytic integration clarifies where the calibrated model could change practice. The choice among strategies is not settled by the model alone: it depends on two cSDH-specific parameters that the evidence leaves genuinely uncertain, the efficacy of AED prophylaxis (no randomised trial exists, and pooled observational estimates, including our own, show no significant seizure reduction) and its disutility in elderly patients (falls, sedation, cognition). Under cSDH-plausible values (relative-risk reduction ≤0.30 or non-trivial disutility) ML-guided allocation had the highest expected net benefit; universal AED was preferable only under optimistic imported assumptions of strong efficacy and negligible harm, and indeed fell below watchful observation once AED efficacy approached zero (a harmful, ineffective drug given to all is worse than treating none). The value of ML-guided allocation did not reduce to treating fewer patients: against a no-information rule treating the same fraction at random, the model retained a positive discrimination premium (≈$1,000–1,600/patient), so the gain reflects the model's discrimination rather than its treated fraction. Value-of-information recomputed under the deployable model and cSDH-grounded priors, the first applied to this question, found ML-guided allocation preferred in expectation with a modest population expected value of perfect information (~$23M over 10 years), and identified AED efficacy and AED harm as the parameters governing the universal-versus-selective choice and thus the priorities for prospective data collection.</w:t>
+        <w:t>The decision-analytic integration clarifies where the calibrated model could change practice. The choice among strategies is not settled by the model alone: it depends on two cSDH-specific parameters that the evidence leaves genuinely uncertain, the efficacy of AED prophylaxis (no randomised trial exists, and pooled observational estimates, including our own, show no significant seizure reduction)</w:t>
+      </w:r>
+      <w:r>
+        <w:rPr>
+          <w:rFonts w:ascii="Times New Roman" w:hAnsi="Times New Roman"/>
+          <w:b w:val="0"/>
+          <w:i w:val="0"/>
+          <w:sz w:val="22"/>
+          <w:vertAlign w:val="superscript"/>
+        </w:rPr>
+        <w:t>⁴³⁻⁴⁶</w:t>
+      </w:r>
+      <w:r>
+        <w:rPr>
+          <w:rFonts w:ascii="Times New Roman" w:hAnsi="Times New Roman"/>
+          <w:b w:val="0"/>
+          <w:i w:val="0"/>
+          <w:sz w:val="22"/>
+        </w:rPr>
+        <w:t xml:space="preserve"> and its disutility in elderly patients (falls, sedation, cognition). Under cSDH-plausible values (relative-risk reduction ≤0.30 or non-trivial disutility) ML-guided allocation had the highest expected net benefit; universal AED was preferable only under optimistic imported assumptions of strong efficacy and negligible harm, and indeed fell below watchful observation once AED efficacy approached zero (a harmful, ineffective drug given to all is worse than treating none). The value of ML-guided allocation did not reduce to treating fewer patients: against a no-information rule treating the same fraction at random, the model retained a positive discrimination premium (≈$1,000–1,600/patient), so the gain reflects the model's discrimination rather than its treated fraction. Value-of-information recomputed under the deployable model and cSDH-grounded priors, the first applied to this question, found ML-guided allocation preferred in expectation with a modest population expected value of perfect information (~$23M over 10 years), and identified AED efficacy and AED harm as the parameters governing the universal-versus-selective choice and thus the priorities for prospective data collection.</w:t>
       </w:r>
     </w:p>
     <w:p>
@@ -1278,7 +1381,45 @@
           <w:i w:val="0"/>
           <w:sz w:val="22"/>
         </w:rPr>
-        <w:t>Relative to prior work, existing cSDH seizure studies are single-centre association analyses that report risk factors rather than a validated prediction model with discrimination metrics: Goertz and colleagues (n = 101) identified preoperative midline shift and membranectomy as independent predictors, and Hamou and colleagues (n = 349) identified depressed postoperative brain volume, but neither reported an AUC or external validation; radiomic seizure models with reported discrimination (e.g. AUC 0.82) exist for acute, not chronic, subdural haematoma and address a different disease entity. To our knowledge no externally validated, calibration-focused seizure-prediction model specific to chronic SDH has been published, which positions the present multi-database, conformal, decision-analytic approach as a methodological contribution rather than an incremental discrimination gain.</w:t>
+        <w:t>Relative to prior work, existing cSDH seizure studies are single-centre association analyses that report risk factors rather than a validated prediction model with discrimination metrics: Goertz and colleagues (n = 101) identified preoperative midline shift and membranectomy as independent predictors, and Hamou and colleagues (n = 349) identified depressed postoperative brain volume, but neither reported an AUC or external validation;</w:t>
+      </w:r>
+      <w:r>
+        <w:rPr>
+          <w:rFonts w:ascii="Times New Roman" w:hAnsi="Times New Roman"/>
+          <w:b w:val="0"/>
+          <w:i w:val="0"/>
+          <w:sz w:val="22"/>
+          <w:vertAlign w:val="superscript"/>
+        </w:rPr>
+        <w:t>¹⁴,¹⁵</w:t>
+      </w:r>
+      <w:r>
+        <w:rPr>
+          <w:rFonts w:ascii="Times New Roman" w:hAnsi="Times New Roman"/>
+          <w:b w:val="0"/>
+          <w:i w:val="0"/>
+          <w:sz w:val="22"/>
+        </w:rPr>
+        <w:t xml:space="preserve"> radiomic seizure models with reported discrimination (e.g. AUC 0.82) exist for acute, not chronic, subdural haematoma and address a different disease entity.</w:t>
+      </w:r>
+      <w:r>
+        <w:rPr>
+          <w:rFonts w:ascii="Times New Roman" w:hAnsi="Times New Roman"/>
+          <w:b w:val="0"/>
+          <w:i w:val="0"/>
+          <w:sz w:val="22"/>
+          <w:vertAlign w:val="superscript"/>
+        </w:rPr>
+        <w:t>¹⁶</w:t>
+      </w:r>
+      <w:r>
+        <w:rPr>
+          <w:rFonts w:ascii="Times New Roman" w:hAnsi="Times New Roman"/>
+          <w:b w:val="0"/>
+          <w:i w:val="0"/>
+          <w:sz w:val="22"/>
+        </w:rPr>
+        <w:t xml:space="preserve"> To our knowledge no externally validated, calibration-focused seizure-prediction model specific to chronic SDH has been published, which positions the present multi-database, conformal, decision-analytic approach as a methodological contribution rather than an incremental discrimination gain.</w:t>
       </w:r>
     </w:p>
     <w:p>
@@ -1495,7 +1636,7 @@
           <w:rFonts w:ascii="Times New Roman" w:hAnsi="Times New Roman"/>
           <w:sz w:val="20"/>
         </w:rPr>
-        <w:t>14. Mohammadi M, Habibzadeh F, Smith J. Machine-learning prediction of seizure after cSDH: pilot. Cureus. 2021;13:e1234. [example placeholder]</w:t>
+        <w:t>14. Hamou HA, Alzaiyani M, Pjontek R, et al. Seizure after surgical treatment of chronic subdural haematoma: associated factors and effect on outcome. Front Neurol. 2022;13:977329.</w:t>
       </w:r>
     </w:p>
     <w:p>
@@ -1507,7 +1648,7 @@
           <w:rFonts w:ascii="Times New Roman" w:hAnsi="Times New Roman"/>
           <w:sz w:val="20"/>
         </w:rPr>
-        <w:t>15. Cohen JT, Patel A, Smith P. Random-forest seizure prediction in neurocritical care. JAMIA. 2020;27(6):987–95. [example placeholder]</w:t>
+        <w:t>15. Goertz L, Speier J, Schulte AP, et al. Independent risk factors for postoperative seizures in chronic subdural haematoma identified by multiple logistic regression analysis. World Neurosurg. 2019;132:e716–e721.</w:t>
       </w:r>
     </w:p>
     <w:p>
@@ -1519,7 +1660,7 @@
           <w:rFonts w:ascii="Times New Roman" w:hAnsi="Times New Roman"/>
           <w:sz w:val="20"/>
         </w:rPr>
-        <w:t>16. Singh A, Brown B, Garcia D. Limitations of single-centre ML models in neurosurgery. NeurosurgFocus. 2022;52(4):E10. [example placeholder]</w:t>
+        <w:t>16. Guranda A, Richter A, Wach J, et al. Radiomic shape features predict early postoperative seizures after acute subdural haematoma evacuation. Brain Sci. 2025;15(2):204.</w:t>
       </w:r>
     </w:p>
     <w:p>
@@ -1832,6 +1973,54 @@
           <w:sz w:val="20"/>
         </w:rPr>
         <w:t>42. Olsson H, Kartasalo K, Mulliqi N, et al. Conformal selective prediction with cost-aware deferral for safe clinical triage under distribution shift. Sci Rep. 2026 (in press).</w:t>
+      </w:r>
+    </w:p>
+    <w:p>
+      <w:pPr>
+        <w:ind w:hanging="432" w:left="432"/>
+      </w:pPr>
+      <w:r>
+        <w:rPr>
+          <w:rFonts w:ascii="Times New Roman" w:hAnsi="Times New Roman"/>
+          <w:sz w:val="20"/>
+        </w:rPr>
+        <w:t>43. Pacheco-Barrios N, Pacheco-Barrios K, et al. Prophylactic antiepileptic drugs in chronic subdural haematoma: systematic review and meta-analysis. Neurosurgery. 2024; doi:10.1227/neu.0000000000003183.</w:t>
+      </w:r>
+    </w:p>
+    <w:p>
+      <w:pPr>
+        <w:ind w:hanging="432" w:left="432"/>
+      </w:pPr>
+      <w:r>
+        <w:rPr>
+          <w:rFonts w:ascii="Times New Roman" w:hAnsi="Times New Roman"/>
+          <w:sz w:val="20"/>
+        </w:rPr>
+        <w:t>44. Nachiappan DS, Garg K. Role of prophylactic antiepileptic drugs in chronic subdural haematoma: a systematic review and meta-analysis. Neurosurg Rev. 2021;44(4):2069–77.</w:t>
+      </w:r>
+    </w:p>
+    <w:p>
+      <w:pPr>
+        <w:ind w:hanging="432" w:left="432"/>
+      </w:pPr>
+      <w:r>
+        <w:rPr>
+          <w:rFonts w:ascii="Times New Roman" w:hAnsi="Times New Roman"/>
+          <w:sz w:val="20"/>
+        </w:rPr>
+        <w:t>45. Ratilal BO, Pappamikail L, Costa J, Sampaio C. Anticonvulsants for preventing seizures in patients with chronic subdural haematoma. Cochrane Database Syst Rev. 2013;(6):CD004893.</w:t>
+      </w:r>
+    </w:p>
+    <w:p>
+      <w:pPr>
+        <w:ind w:hanging="432" w:left="432"/>
+      </w:pPr>
+      <w:r>
+        <w:rPr>
+          <w:rFonts w:ascii="Times New Roman" w:hAnsi="Times New Roman"/>
+          <w:sz w:val="20"/>
+        </w:rPr>
+        <w:t>46. Lavergne P, Labidi M, Brunette-Clément T, et al. Efficacy of antiseizure prophylaxis in chronic subdural haematoma: a cohort study on routinely collected health data. J Neurosurg. 2019;132(1):284–91.</w:t>
       </w:r>
     </w:p>
     <w:p>

</xml_diff>

<commit_message>
Figures: JNNP-quality rebuild of F4/F5/F6 + caption/text reconciliation
- F4: strip baked caption block, orange callout box, em-dash titles, hardcoded font; clean 2-panel matching F1-F3 house style (caption content moved to docx legend)
- F5: native rebuild (CE plane + CEAC from postop-B PSA); illegible decision tree removed from main figure (available for supplement)
- F6: native rebuild (one-way tornado + two-way optimal-strategy map) replacing stale $190M/cEEG-EVPPI tornado -> resolves VOI/EVPPI contradiction
- Reconcile text: limitations EVPPI claim -> AED efficacy/harm govern; LOHO label -> REML primary (matches 0.684); ref order (Goertz 14, Hamou 15, Guranda 16) matches in-text cites
- All six figures regenerated through one rcParams stylesheet for consistency
</commit_message>
<xml_diff>
--- a/docs/main_manuscript.docx
+++ b/docs/main_manuscript.docx
@@ -787,7 +787,7 @@
           <w:i w:val="0"/>
           <w:sz w:val="22"/>
         </w:rPr>
-        <w:t>Pre-specified analyses included a temporal-leakage audit excluding 24- and 48-hour rolling features and the prophylactic-AED indicator; cohort-definition sensitivity across four eICU strata; leave-one-hospital-out cross-validation with DerSimonian–Laird random-effects pooling and Hanley–McNeil within-study variance; calibration after cross-validated Platt scaling; decision-curve net benefit (Vickers) across thresholds 0–30%; cause-specific Cox modelling with in-hospital death as a competing event and an inverse-probability-of-censoring-weighted (IPCW) Fine–Gray subdistribution-hazard model (Geskus); Little's MCAR test and Rubin's-rules pooling across ten imputations; and λ-path-tuned group-LASSO via custom proximal-gradient solver.</w:t>
+        <w:t>Pre-specified analyses included a temporal-leakage audit excluding 24- and 48-hour rolling features and the prophylactic-AED indicator; cohort-definition sensitivity across four eICU strata; leave-one-hospital-out cross-validation with random-effects pooling (REML primary; DerSimonian–Laird and Paule–Mandel as sensitivity, Appendix S7) and Hanley–McNeil within-study variance; calibration after cross-validated Platt scaling; decision-curve net benefit (Vickers) across thresholds 0–30%; cause-specific Cox modelling with in-hospital death as a competing event and an inverse-probability-of-censoring-weighted (IPCW) Fine–Gray subdistribution-hazard model (Geskus); Little's MCAR test and Rubin's-rules pooling across ten imputations; and λ-path-tuned group-LASSO via custom proximal-gradient solver.</w:t>
       </w:r>
     </w:p>
     <w:p>
@@ -1435,7 +1435,7 @@
           <w:i w:val="0"/>
           <w:sz w:val="22"/>
         </w:rPr>
-        <w:t>This study has limitations. The development cohort is single-institution, partly mitigated by external evaluation across 42 eICU hospitals with low logit-scale between-site heterogeneity. Calibration-in-the-large and decision-curve net benefit are the robust calibration findings; the recalibration slope exceeds one (under-dispersed predictions), reflecting weak discrimination over a narrow probability range at 48 events. The structured electronic medical record lacks imaging features known to inform seizure risk (sulcal effacement, midline shift magnitude, density heterogeneity); future work could augment the candidate model with imaging-derived covariates extracted from radiology free-text or directly from CT scans. Outcome ascertainment is administrative rather than EEG-adjudicated; sensitivity analyses across four time-window cuts preserved the primary AUC. Cost inputs adopt the US-payer perspective; the VOI analysis explicitly identifies per-day cEEG cost as the highest-EVPPI parameter for international refinement.</w:t>
+        <w:t>This study has limitations. The development cohort is single-institution, partly mitigated by external evaluation across 42 eICU hospitals with low logit-scale between-site heterogeneity. Calibration-in-the-large and decision-curve net benefit are the robust calibration findings; the recalibration slope exceeds one (under-dispersed predictions), reflecting weak discrimination over a narrow probability range at 48 events. The structured electronic medical record lacks imaging features known to inform seizure risk (sulcal effacement, midline shift magnitude, density heterogeneity); future work could augment the candidate model with imaging-derived covariates extracted from radiology free-text or directly from CT scans. Outcome ascertainment is administrative rather than EEG-adjudicated; sensitivity analyses across four time-window cuts preserved the primary AUC. Cost inputs adopt the US-payer perspective; the decision-sensitivity analysis identifies AED efficacy and AED harm as the parameters governing the strategy choice, and we report UK (NICE) and Eurozone cost perspectives as sensitivity analyses.</w:t>
       </w:r>
     </w:p>
     <w:p>
@@ -1636,7 +1636,7 @@
           <w:rFonts w:ascii="Times New Roman" w:hAnsi="Times New Roman"/>
           <w:sz w:val="20"/>
         </w:rPr>
-        <w:t>14. Hamou HA, Alzaiyani M, Pjontek R, et al. Seizure after surgical treatment of chronic subdural haematoma: associated factors and effect on outcome. Front Neurol. 2022;13:977329.</w:t>
+        <w:t>14. Goertz L, Speier J, Schulte AP, et al. Independent risk factors for postoperative seizures in chronic subdural haematoma identified by multiple logistic regression analysis. World Neurosurg. 2019;132:e716–e721.</w:t>
       </w:r>
     </w:p>
     <w:p>
@@ -1648,7 +1648,7 @@
           <w:rFonts w:ascii="Times New Roman" w:hAnsi="Times New Roman"/>
           <w:sz w:val="20"/>
         </w:rPr>
-        <w:t>15. Goertz L, Speier J, Schulte AP, et al. Independent risk factors for postoperative seizures in chronic subdural haematoma identified by multiple logistic regression analysis. World Neurosurg. 2019;132:e716–e721.</w:t>
+        <w:t>15. Hamou HA, Alzaiyani M, Pjontek R, et al. Seizure after surgical treatment of chronic subdural haematoma: associated factors and effect on outcome. Front Neurol. 2022;13:977329.</w:t>
       </w:r>
     </w:p>
     <w:p>
@@ -2563,7 +2563,7 @@
           <w:i/>
           <w:sz w:val="20"/>
         </w:rPr>
-        <w:t>Figure 1.  Multi-database discrimination. A, BIDMC primary cohort: Firth penalized logistic regression and BalancedRandomForest with bootstrap 95% CIs. B, eICU leave-one-hospital-out random-effects pooled estimates (DerSimonian–Laird) across cohort × feature-set combinations. C, Temporal-leakage audit: the strict pre-seizure feature subset (green) preserves discrimination in the full eICU cohort.</w:t>
+        <w:t>Figure 1.  Multi-database discrimination. A, BIDMC primary cohort: Firth penalized logistic regression and BalancedRandomForest with bootstrap 95% CIs. B, eICU leave-one-hospital-out random-effects pooled estimates (REML; estimators compared in Appendix S7) across cohort × feature-set combinations. C, Temporal-leakage audit: the strict pre-seizure feature subset (green) preserves discrimination in the full eICU cohort.</w:t>
       </w:r>
     </w:p>
     <w:p>
@@ -2719,7 +2719,7 @@
       <w:r>
         <w:drawing>
           <wp:inline xmlns:a="http://schemas.openxmlformats.org/drawingml/2006/main" xmlns:pic="http://schemas.openxmlformats.org/drawingml/2006/picture">
-            <wp:extent cx="5943600" cy="4262954"/>
+            <wp:extent cx="5943600" cy="3076954"/>
             <wp:docPr id="4" name="Picture 4"/>
             <wp:cNvGraphicFramePr>
               <a:graphicFrameLocks noChangeAspect="1"/>
@@ -2740,7 +2740,7 @@
                   <pic:spPr>
                     <a:xfrm>
                       <a:off x="0" y="0"/>
-                      <a:ext cx="5943600" cy="4262954"/>
+                      <a:ext cx="5943600" cy="3076954"/>
                     </a:xfrm>
                     <a:prstGeom prst="rect"/>
                   </pic:spPr>
@@ -2761,7 +2761,7 @@
           <w:i/>
           <w:sz w:val="20"/>
         </w:rPr>
-        <w:t>Figure 4.  Class-conditional conformal prediction on the candidate Firth postoperative-B model. A, Empirical class-conditional coverage near the target 1−α across α ∈ {0.05, 0.10, 0.20}. B, Rule-out and rule-in singleton fractions versus α; at α = 0.10 the procedure delivers confident decisions for 22% of patients (rule-out 11%, rule-in 11%).</w:t>
+        <w:t>Figure 4.  Class-conditional conformal prediction on the candidate Firth postoperative-B model. A, Empirical class-conditional coverage near the target 1−α across α ∈ {0.05, 0.10, 0.20} (90.3% no-seizure, 93.8% seizure at α = 0.10). B, Rule-out and rule-in singleton fractions versus α; at α = 0.10 the procedure delivers a confident singleton in 22% of patients (rule-out 11%, rule-in 11%) and defers the remaining 78%. Each prediction set maps to an action: singleton {no-seizure} → observation (skip AED); singleton {seizure} → continuous EEG plus targeted AED; doubleton {seizure, no-seizure} → defer to clinical judgment. Conformal quantiles are fit on a held-out calibration split; rates and coverage are out-of-fold.</w:t>
       </w:r>
     </w:p>
     <w:p>
@@ -2785,7 +2785,7 @@
       <w:r>
         <w:drawing>
           <wp:inline xmlns:a="http://schemas.openxmlformats.org/drawingml/2006/main" xmlns:pic="http://schemas.openxmlformats.org/drawingml/2006/picture">
-            <wp:extent cx="5943600" cy="7056264"/>
+            <wp:extent cx="5943600" cy="3008793"/>
             <wp:docPr id="5" name="Picture 5"/>
             <wp:cNvGraphicFramePr>
               <a:graphicFrameLocks noChangeAspect="1"/>
@@ -2806,7 +2806,7 @@
                   <pic:spPr>
                     <a:xfrm>
                       <a:off x="0" y="0"/>
-                      <a:ext cx="5943600" cy="7056264"/>
+                      <a:ext cx="5943600" cy="3008793"/>
                     </a:xfrm>
                     <a:prstGeom prst="rect"/>
                   </pic:spPr>
@@ -2851,7 +2851,7 @@
       <w:r>
         <w:drawing>
           <wp:inline xmlns:a="http://schemas.openxmlformats.org/drawingml/2006/main" xmlns:pic="http://schemas.openxmlformats.org/drawingml/2006/picture">
-            <wp:extent cx="5943600" cy="3921715"/>
+            <wp:extent cx="5943600" cy="3365990"/>
             <wp:docPr id="6" name="Picture 6"/>
             <wp:cNvGraphicFramePr>
               <a:graphicFrameLocks noChangeAspect="1"/>
@@ -2872,7 +2872,7 @@
                   <pic:spPr>
                     <a:xfrm>
                       <a:off x="0" y="0"/>
-                      <a:ext cx="5943600" cy="3921715"/>
+                      <a:ext cx="5943600" cy="3365990"/>
                     </a:xfrm>
                     <a:prstGeom prst="rect"/>
                   </pic:spPr>
@@ -2893,7 +2893,7 @@
           <w:i/>
           <w:sz w:val="20"/>
         </w:rPr>
-        <w:t>Figure 6.  Value of information. A, Per-parameter EVPPI tornado at WTP $100,000/QALY; the four highlighted parameters define the research-priority frontier. B, Per-patient EVPI as a function of willingness-to-pay threshold.</w:t>
+        <w:t>Figure 6.  Decision sensitivity and value of information. A, One-way sensitivity at WTP $100,000/QALY: net-benefit swing of ML-guided allocation versus universal AED across each parameter's plausible range; AED efficacy and AED disutility (highlighted) dominate the decision. B, Two-way optimal-strategy map over AED relative-risk reduction and AED disutility: ML-guided allocation is preferred across the cSDH-plausible region, universal AED only under high efficacy and negligible harm. Under cSDH-grounded priors the population expected value of perfect information at $100k/QALY is approximately $23M over 10 years; no single parameter individually reverses the decision within its prior range.</w:t>
       </w:r>
     </w:p>
     <w:p>

</xml_diff>

<commit_message>
Manuscript: anchor CEA base case to cSDH-grounded RRR 0.15; candidate (not deployed) model wording
</commit_message>
<xml_diff>
--- a/docs/main_manuscript.docx
+++ b/docs/main_manuscript.docx
@@ -347,7 +347,7 @@
           <w:i w:val="0"/>
           <w:sz w:val="22"/>
         </w:rPr>
-        <w:t>Firth penalized logistic regression was the candidate model, fit on a leakage-safe postoperative-B feature set (18 variables available at the end of evacuation, before the AED/EEG decision); it discriminated at AUC 0.645. A postoperative-A set that additionally included three peri-decision variables reached AUC 0.681 (95% CI 0.609–0.753) but is not deployable, the difference lying within the Bernoulli noise floor at 48 events. Firth matched BalancedRandomForest discrimination (DeLong p = 0.81) with markedly better calibration (Brier 0.068 vs 0.228) and calibration-in-the-large near zero, though predictions remained under-dispersed (recalibration slope &gt;1) given the narrow probability range at 48 events. Eleven model classes converged on an AUC ceiling near 0.68 consistent with 2022–2025 meta-evidence. In external evaluation on a related (mixed-acuity ICU) population, AUC was 0.750 (0.711–0.774); random-effects pooled AUC across 42 hospitals was 0.684 (95% CI 0.651–0.714; logit-scale I²=0%, raw-scale 95% prediction interval 0.53–0.95). Class-conditional conformal prediction at α=0.10 gave confident singleton predictions in 22% of patients (rule-out 11%; rule-in 11%). ML-guided allocation beat watchful observation and, at a matched treated fraction, beat random allocation (discrimination premium ≈$1,000–1,600/patient), confirming the model, not the treated fraction, added value. The choice between universal AED and ML-guided allocation depended on AED efficacy and harm in cSDH (both uncertain): under cSDH-plausible values ML-guided allocation had the highest expected net benefit, whereas universal AED was preferable only under optimistic, imported efficacy assumptions. Population value of perfect information at $100k/QALY was approximately $23M over 10 years.</w:t>
+        <w:t>Firth penalized logistic regression was the candidate model, fit on a leakage-safe postoperative-B feature set (18 variables available at the end of evacuation, before the AED/EEG decision); it discriminated at AUC 0.645. A postoperative-A set that additionally included three peri-decision variables reached AUC 0.681 (95% CI 0.609–0.753) but is not deployable, the difference lying within the Bernoulli noise floor at 48 events. Firth matched BalancedRandomForest discrimination (DeLong p = 0.81) with markedly better calibration (Brier 0.068 vs 0.228) and calibration-in-the-large near zero, though predictions remained under-dispersed (recalibration slope &gt;1) given the narrow probability range at 48 events. Eleven model classes converged on an AUC ceiling near 0.68 consistent with 2022–2025 meta-evidence. In external evaluation on a related (mixed-acuity ICU) population, AUC was 0.750 (0.711–0.774); random-effects pooled AUC across 42 hospitals was 0.684 (95% CI 0.651–0.714; logit-scale I²=0%, raw-scale 95% prediction interval 0.53–0.95). Class-conditional conformal prediction at α=0.10 gave confident singleton predictions in 22% of patients (rule-out 11%; rule-in 11%). ML-guided allocation — selective AED prophylaxis as the primary deployable strategy, or selective continuous-EEG monitoring where available — beat watchful observation and, at a matched treated fraction, beat random allocation (discrimination premium ≈$1,000–1,600/patient), confirming the model, not the treated fraction, added value. ML-guided allocation was preferred to universal AED under cSDH-plausible AED assumptions; universal AED was preferable only under optimistic, imported efficacy. Selective AED is the simplest to deploy and assumes AED has some efficacy, whereas selective monitoring retains value even if AED is ineffective. Population value of perfect information at $100k/QALY was approximately $23M over 10 years.</w:t>
       </w:r>
     </w:p>
     <w:p>
@@ -371,7 +371,7 @@
           <w:i w:val="0"/>
           <w:sz w:val="22"/>
         </w:rPr>
-        <w:t>For postoperative seizure after cSDH evacuation, optimising small-cohort clinical machine learning for calibration and individual-patient decision support, rather than discrimination, yields a candidate model that meets methodological preconditions for prospective clinical evaluation. Whether selective ML-guided prophylaxis is preferable to treating all or none hinges on AED efficacy and harm in cSDH, which current evidence leaves uncertain; value-of-information prioritises resolving these.</w:t>
+        <w:t>For postoperative seizure after cSDH evacuation, optimising small-cohort clinical machine learning for calibration and individual-patient decision support, rather than discrimination, yields a candidate model that meets methodological preconditions for prospective clinical evaluation. Selective, ML-guided AED prophylaxis is the primary deployable strategy, with selective continuous-EEG monitoring as an enhanced option where available; whether selective allocation is preferable to treating all or none hinges on AED efficacy and harm in cSDH, which current evidence leaves uncertain; value-of-information prioritises resolving these.</w:t>
       </w:r>
     </w:p>
     <w:p>
@@ -976,7 +976,7 @@
           <w:i w:val="0"/>
           <w:sz w:val="22"/>
         </w:rPr>
-        <w:t xml:space="preserve"> Because cSDH-specific AED efficacy is unproven, no randomised trial exists and pooled observational estimates show no significant seizure reduction, the AED relative-risk reduction was anchored at an imported base case of 0.45 (post-traumatic/tumour literature) purely as an optimistic reference, with the cSDH-plausible range of 0–0.30 and the AED disutility (0.02–0.15) explored in one-way and two-way sensitivity analyses, alongside UK (NICE) and Eurozone cost perspectives. The ML strategies act on the conformal partition described above. Probabilistic sensitivity used 10,000 Monte Carlo iterations. Expected value of perfect information (EVPI) and per-parameter partial perfect information (EVPPI) were estimated by Strong–Oakley non-parametric regression on 5,000 PSA samples,</w:t>
+        <w:t xml:space="preserve"> Because cSDH-specific AED efficacy is unproven, no randomised trial exists and pooled observational estimates show no significant seizure reduction, the base case anchored the AED relative-risk reduction at a cSDH-grounded prior (mean 0.15, 95% interval 0.01–0.45), matching the value-of-information analysis. An imported value of 0.45 (post-traumatic/tumour literature) was carried only as an optimistic upper reference. AED relative-risk reduction (0–0.45) and AED disutility (0.02–0.15) were explored in one-way and two-way sensitivity analyses, alongside UK (NICE) and Eurozone cost perspectives. The ML strategies act on the conformal partition described above. Probabilistic sensitivity used 10,000 Monte Carlo iterations. Expected value of perfect information (EVPI) and per-parameter partial perfect information (EVPPI) were estimated by Strong–Oakley non-parametric regression on 5,000 PSA samples,</w:t>
       </w:r>
       <w:r>
         <w:rPr>
@@ -1227,7 +1227,7 @@
           <w:i w:val="0"/>
           <w:sz w:val="22"/>
         </w:rPr>
-        <w:t>At the candidate operating point, the calibrated base-rate threshold of 7.3%, the postoperative-B model had sensitivity 0.50 (95% CI 0.36–0.64), specificity 0.70 (0.66–0.74), positive predictive value 0.12 (0.07–0.16) and negative predictive value 0.95 (0.93–0.97). The optimal strategy depended on AED efficacy and AED harm in cSDH, both of which the evidence leaves uncertain. Under the optimistic, externally-imported reference (AED relative-risk reduction 0.45, negligible disutility) universal AED had the highest expected net benefit by a small margin (≈$1k on a ≈$641k base). When AED efficacy was set to the cSDH-plausible range (no study demonstrates a significant protective effect), the ranking changed: ML-guided allocation had the highest expected net benefit once the relative-risk reduction fell to ≤0.30 or AED disutility reached ≥0.10. The advantage of ML-guided allocation was not merely a consequence of treating fewer patients: against a no-information policy that treated the same fraction at random, the model retained a positive discrimination premium of ≈$1,000–1,600 per patient across all efficacy scenarios, confirming that the model's discrimination, not its treated fraction, created the value. ML-guided allocation also exceeded watchful observation at every efficacy value (universal AED, by contrast, fell below observation once AED efficacy approached zero, because a harmful, ineffective drug given to everyone is worse than treating no-one). The ordering was stable across the three conformal-to-action mappings and across US, UK (NICE) and Eurozone cost perspectives (Figure 5; Supplementary Appendix S6). In a value-of-information analysis recomputed under the deployable model and cSDH-grounded AED priors, to our knowledge the first applied to this question, ML-guided allocation was preferred in expectation and the population expected value of perfect information at $100k/QALY was approximately $23M over 10 years; no single parameter individually reversed the decision within its prior range, while the deterministic sensitivity analysis identified AED efficacy and AED harm as the parameters governing the universal-versus-selective comparison (Figure 6).</w:t>
+        <w:t>At the candidate operating point, the calibrated base-rate threshold of 7.3%, the postoperative-B model had sensitivity 0.50 (95% CI 0.36–0.64), specificity 0.70 (0.66–0.74), positive predictive value 0.12 (0.07–0.16) and negative predictive value 0.95 (0.93–0.97). The optimal strategy depended on AED efficacy and AED harm in cSDH, both of which the evidence leaves uncertain. Under the optimistic, externally-imported reference (AED relative-risk reduction 0.45, negligible disutility) universal AED had the highest expected net benefit by a small margin (≈$1k on a ≈$641k base). When AED efficacy was set to the cSDH-plausible range (no study demonstrates a significant protective effect), the ranking changed: ML-guided allocation had the highest expected net benefit once the relative-risk reduction fell to ≤0.30 or AED disutility reached ≥0.10. The advantage of ML-guided allocation was not merely a consequence of treating fewer patients: against a no-information policy that treated the same fraction at random, the model retained a positive discrimination premium of ≈$1,000–1,600 per patient across all efficacy scenarios, confirming that the model's discrimination, not its treated fraction, created the value. ML-guided allocation also exceeded watchful observation at every efficacy value (universal AED, by contrast, fell below observation once AED efficacy approached zero, because a harmful, ineffective drug given to everyone is worse than treating no-one). The ordering was stable across the three conformal-to-action mappings and across US, UK (NICE) and Eurozone cost perspectives (Figure 5; Supplementary Appendix S6). The ML-guided family comprises two forms: selective AED prophylaxis, the primary deployable strategy (prophylaxis to model-flagged high-risk patients only, requiring no additional infrastructure), and selective continuous-EEG monitoring, an enhanced option where monitoring is available. Selective AED is preferred where AED has modest efficacy or continuous EEG is unavailable, whereas selective monitoring carries the value when AED efficacy is low because it detects seizures irrespective of prophylaxis; both dominate universal AED and observation under cSDH-plausible assumptions (Figure 5B–D). In a value-of-information analysis recomputed under the deployable model and cSDH-grounded AED priors, to our knowledge the first applied to this question, ML-guided allocation was preferred in expectation and the population expected value of perfect information at $100k/QALY was approximately $23M over 10 years; no single parameter individually reversed the decision within its prior range, while the deterministic sensitivity analysis identified AED efficacy and AED harm as the parameters governing the universal-versus-selective comparison (Figure 6).</w:t>
       </w:r>
     </w:p>
     <w:p>
@@ -1435,7 +1435,7 @@
           <w:i w:val="0"/>
           <w:sz w:val="22"/>
         </w:rPr>
-        <w:t>This study has limitations. The development cohort is single-institution, partly mitigated by external evaluation across 42 eICU hospitals with low logit-scale between-site heterogeneity. Calibration-in-the-large and decision-curve net benefit are the robust calibration findings; the recalibration slope exceeds one (under-dispersed predictions), reflecting weak discrimination over a narrow probability range at 48 events. The structured electronic medical record lacks imaging features known to inform seizure risk (sulcal effacement, midline shift magnitude, density heterogeneity); future work could augment the candidate model with imaging-derived covariates extracted from radiology free-text or directly from CT scans. Outcome ascertainment is administrative rather than EEG-adjudicated; sensitivity analyses across four time-window cuts preserved the primary AUC. Cost inputs adopt the US-payer perspective; the decision-sensitivity analysis identifies AED efficacy and AED harm as the parameters governing the strategy choice, and we report UK (NICE) and Eurozone cost perspectives as sensitivity analyses.</w:t>
+        <w:t>This study has limitations. The development cohort is single-institution. The eICU Collaborative Research Database provides external evaluation, but this is not a strict external validation of the deployable model: the eICU analysis re-fits a separate model on eICU's own 103-variable feature set in a related, mixed-acuity intensive-care population, rather than applying the fixed BIDMC postoperative-B Firth model, with its development coefficients, to an independent chronic subdural haematoma surgical cohort. It therefore establishes that the prediction signal is reproducible across 42 hospitals (with low logit-scale between-site heterogeneity), not that the deployable model transports unchanged; true external validation of the candidate model on an independent cSDH cohort, ideally prospective, remains essential future work. Calibration-in-the-large and decision-curve net benefit are the robust calibration findings; the recalibration slope exceeds one (under-dispersed predictions), reflecting weak discrimination over a narrow probability range at 48 events. The structured electronic medical record lacks imaging features known to inform seizure risk (sulcal effacement, midline shift magnitude, density heterogeneity); future work could augment the candidate model with imaging-derived covariates extracted from radiology free-text or directly from CT scans. Outcome ascertainment is administrative rather than EEG-adjudicated; sensitivity analyses across four time-window cuts preserved the primary AUC. Cost inputs adopt the US-payer perspective; the decision-sensitivity analysis identifies AED efficacy and AED harm as the parameters governing the strategy choice, and we report UK (NICE) and Eurozone cost perspectives as sensitivity analyses.</w:t>
       </w:r>
     </w:p>
     <w:p>
@@ -1451,7 +1451,7 @@
           <w:i w:val="0"/>
           <w:sz w:val="22"/>
         </w:rPr>
-        <w:t>In conclusion, calibrated machine-learning prediction of postoperative seizure after cSDH evacuation, paired with class-conditional conformal prediction, is feasible and meets methodological preconditions for prospective evaluation, supporting individual-patient decisions, for the minority of patients in whom the conformal procedure yields a confident prediction, with formal coverage guarantees. ML-guided allocation exceeds watchful observation; whether to allocate prophylaxis selectively with the model rather than treat all or none depends on AED efficacy and harm in cSDH, which current evidence leaves uncertain. Consistent with this, the value-of-information analysis shows the model's discrimination carries modest decision value relative to AED efficacy and per-day cEEG cost; the methodological contribution is the calibration-and-conformal decision framework, and the priority for prospective work is resolving the AED and monitoring parameters.</w:t>
+        <w:t>In conclusion, calibrated machine-learning prediction of postoperative seizure after cSDH evacuation, paired with class-conditional conformal prediction, is feasible and meets methodological preconditions for prospective evaluation, supporting individual-patient decisions, for the minority of patients in whom the conformal procedure yields a confident prediction, with formal coverage guarantees. The primary deployable strategy is selective, ML-guided AED prophylaxis — giving prophylaxis only to model-flagged high-risk patients — with selective continuous-EEG monitoring as an enhanced option where monitoring is available; both exceed watchful observation and universal AED under cSDH-plausible assumptions. Whether to allocate prophylaxis selectively with the model rather than treat all or none depends on AED efficacy and harm in cSDH, which current evidence leaves uncertain. Consistent with this, the value-of-information analysis shows the model's discrimination carries modest decision value relative to AED efficacy and per-day cEEG cost; the methodological contribution is the calibration-and-conformal decision framework, and the priority for prospective work is resolving the AED and monitoring parameters.</w:t>
       </w:r>
     </w:p>
     <w:p>
@@ -2521,7 +2521,7 @@
       <w:r>
         <w:drawing>
           <wp:inline xmlns:a="http://schemas.openxmlformats.org/drawingml/2006/main" xmlns:pic="http://schemas.openxmlformats.org/drawingml/2006/picture">
-            <wp:extent cx="5943600" cy="5288339"/>
+            <wp:extent cx="5943600" cy="5360179"/>
             <wp:docPr id="1" name="Picture 1"/>
             <wp:cNvGraphicFramePr>
               <a:graphicFrameLocks noChangeAspect="1"/>
@@ -2542,7 +2542,7 @@
                   <pic:spPr>
                     <a:xfrm>
                       <a:off x="0" y="0"/>
-                      <a:ext cx="5943600" cy="5288339"/>
+                      <a:ext cx="5943600" cy="5360179"/>
                     </a:xfrm>
                     <a:prstGeom prst="rect"/>
                   </pic:spPr>
@@ -2563,7 +2563,7 @@
           <w:i/>
           <w:sz w:val="20"/>
         </w:rPr>
-        <w:t>Figure 1.  Multi-database discrimination. A, BIDMC primary cohort: Firth penalized logistic regression and BalancedRandomForest with bootstrap 95% CIs. B, eICU leave-one-hospital-out random-effects pooled estimates (REML; estimators compared in Appendix S7) across cohort × feature-set combinations. C, Temporal-leakage audit: the strict pre-seizure feature subset (green) preserves discrimination in the full eICU cohort.</w:t>
+        <w:t>Figure 1.  Multi-database discrimination. A, BIDMC primary cohort: Firth penalized logistic regression and BalancedRandomForest with bootstrap 95% CIs. B, eICU leave-one-hospital-out random-effects pooled estimates (REML; estimators compared in Appendix S7) across cohort × feature-set combinations. C, Temporal-leakage audit. Discrimination is re-estimated under progressively stricter exclusion of seizures occurring soon after index (retaining only events at ≥1h, ≥24h and ≥72h, so that the time-windowed features provably predate the event), alongside the strict pre-seizure feature subset (green). Discrimination is preserved rather than collapsing toward chance, indicating the signal is not a leakage artefact; event counts are shown because the ≥72h restriction leaves only 40 events, so its higher point estimate (AUC 0.78, widest CI) reflects small-sample variability rather than a genuine gain, and the ≥24h restriction (76 events, AUC 0.72) is the most reliable leakage-controlled estimate.</w:t>
       </w:r>
     </w:p>
     <w:p>
@@ -2629,7 +2629,7 @@
           <w:i/>
           <w:sz w:val="20"/>
         </w:rPr>
-        <w:t>Figure 2.  Calibration and clinical utility. A, Calibration after Platt scaling, with bootstrap 95% CIs on per-bin observed event rates. B, Decision-curve net benefit across probability thresholds; the model outperforms 'treat all' and 'treat none' in the clinically relevant 5–15% band.</w:t>
+        <w:t>Figure 2.  Calibration and clinical utility of the candidate model. A, LOWESS-smoothed calibration (observed event rate versus predicted risk, with a 95% bootstrap band) for the candidate BIDMC postoperative-B (Firth) model and the external eICU Set C model, each drawn over the range of predicted risk it actually produces; the marginal rug shows the density of predicted risk. The candidate model is well calibrated in the mean (mean predicted risk equals the 7% base rate) but under-dispersed, so its predictions are compressed into a narrow low range near the base rate rather than extending up the diagonal. B, Decision-curve net benefit computed from the same out-of-fold predictions; both models exceed 'treat all' and 'treat none' across the clinically relevant 5–15% threshold band.</w:t>
       </w:r>
     </w:p>
     <w:p>
@@ -2653,7 +2653,7 @@
       <w:r>
         <w:drawing>
           <wp:inline xmlns:a="http://schemas.openxmlformats.org/drawingml/2006/main" xmlns:pic="http://schemas.openxmlformats.org/drawingml/2006/picture">
-            <wp:extent cx="5943600" cy="4188144"/>
+            <wp:extent cx="5943600" cy="4114629"/>
             <wp:docPr id="3" name="Picture 3"/>
             <wp:cNvGraphicFramePr>
               <a:graphicFrameLocks noChangeAspect="1"/>
@@ -2674,7 +2674,7 @@
                   <pic:spPr>
                     <a:xfrm>
                       <a:off x="0" y="0"/>
-                      <a:ext cx="5943600" cy="4188144"/>
+                      <a:ext cx="5943600" cy="4114629"/>
                     </a:xfrm>
                     <a:prstGeom prst="rect"/>
                   </pic:spPr>
@@ -2785,7 +2785,7 @@
       <w:r>
         <w:drawing>
           <wp:inline xmlns:a="http://schemas.openxmlformats.org/drawingml/2006/main" xmlns:pic="http://schemas.openxmlformats.org/drawingml/2006/picture">
-            <wp:extent cx="5943600" cy="3008793"/>
+            <wp:extent cx="5943600" cy="4612183"/>
             <wp:docPr id="5" name="Picture 5"/>
             <wp:cNvGraphicFramePr>
               <a:graphicFrameLocks noChangeAspect="1"/>
@@ -2806,7 +2806,7 @@
                   <pic:spPr>
                     <a:xfrm>
                       <a:off x="0" y="0"/>
-                      <a:ext cx="5943600" cy="3008793"/>
+                      <a:ext cx="5943600" cy="4612183"/>
                     </a:xfrm>
                     <a:prstGeom prst="rect"/>
                   </pic:spPr>
@@ -2827,7 +2827,7 @@
           <w:i/>
           <w:sz w:val="20"/>
         </w:rPr>
-        <w:t>Figure 5.  Cost-effectiveness analysis. A, Decision tree with base-case rollback per strategy. B, Cost-effectiveness plane from 10,000-iteration probabilistic sensitivity. C, Cost-effectiveness acceptability curves over willingness-to-pay.</w:t>
+        <w:t>Figure 5.  Cost-effectiveness of the deployable postoperative-B model, from 10,000-iteration probabilistic sensitivity analysis (the base-case decision tree is shown in the Supplementary Appendix). A, Cost-effectiveness plane for the base case: incremental cost and QALYs of each active strategy versus observation (faint points, PSA iterations; solid markers, means; dashed line, $100,000/QALY). B–D, Cost-effectiveness acceptability curves (probability each strategy is optimal versus willingness-to-pay) under three scenarios that differ only in AED efficacy, AED disutility and continuous-EEG cost, showing that the optimal strategy is assumption-dependent. B, cSDH-grounded base case (AED relative-risk reduction mean 0.15, 95% interval 0.01–0.45, no proven effect; cEEG cost-effective), matching the value-of-information analysis: ML-guided cEEG is most often optimal. C, AED modestly effective with real harm and costly monitoring (relative-risk reduction ~0.20, cEEG cost ×2.5): ML-guided AED is most often optimal. D, optimistic imported efficacy with negligible AED harm (relative-risk reduction ~0.45): universal AED is most often optimal. Universal AED is preferred only under the least cSDH-supported assumptions (panel D); see Figure 6 for the formal threshold analysis.</w:t>
       </w:r>
     </w:p>
     <w:p>
@@ -2893,7 +2893,7 @@
           <w:i/>
           <w:sz w:val="20"/>
         </w:rPr>
-        <w:t>Figure 6.  Decision sensitivity and value of information. A, One-way sensitivity at WTP $100,000/QALY: net-benefit swing of ML-guided allocation versus universal AED across each parameter's plausible range; AED efficacy and AED disutility (highlighted) dominate the decision. B, Two-way optimal-strategy map over AED relative-risk reduction and AED disutility: ML-guided allocation is preferred across the cSDH-plausible region, universal AED only under high efficacy and negligible harm. Under cSDH-grounded priors the population expected value of perfect information at $100k/QALY is approximately $23M over 10 years; no single parameter individually reverses the decision within its prior range.</w:t>
+        <w:t>Figure 6.  Decision sensitivity and value of information, anchored at the cSDH-grounded base case (AED relative-risk reduction 0.15), where ML-guided allocation is preferred by ≈$1,800/patient. A, One-way sensitivity at WTP $100,000/QALY: net-benefit swing of the best ML-guided strategy (AED-only or with cEEG) versus universal AED across each parameter's plausible range. AED efficacy is the only parameter whose range can make universal AED optimal (rust); ML-guided allocation stays optimal across the range of every other parameter (navy). B, Two-way optimal-strategy map over AED relative-risk reduction and AED disutility: ML-guided allocation is preferred across the cSDH-plausible region, universal AED only under high efficacy and negligible harm. Under cSDH-grounded priors the population expected value of perfect information at $100k/QALY is approximately $23M over 10 years.</w:t>
       </w:r>
     </w:p>
     <w:p>

</xml_diff>

<commit_message>
Manuscript: trim title, fix ref 20 preprint citation, correct word count, soften phenotype claim
</commit_message>
<xml_diff>
--- a/docs/main_manuscript.docx
+++ b/docs/main_manuscript.docx
@@ -12,7 +12,7 @@
           <w:b/>
           <w:sz w:val="30"/>
         </w:rPr>
-        <w:t>Postoperative seizure after chronic subdural haematoma evacuation: a calibration-focused, conformal-prediction proof-of-concept with multi-database evaluation and value-of-information analysis</w:t>
+        <w:t>Postoperative seizure after chronic subdural haematoma evacuation: a calibration-focused, conformal-prediction proof-of-concept with value-of-information analysis</w:t>
       </w:r>
     </w:p>
     <w:p>
@@ -129,7 +129,7 @@
           <w:i w:val="0"/>
           <w:sz w:val="20"/>
         </w:rPr>
-        <w:t>Word count, abstract: 250 · main text: ~4,050 · Figures: 6 · Tables: 1 · Supplementary: yes · References: 46</w:t>
+        <w:t>Word count, abstract: 250 · main text: ~3,400 · Figures: 6 · Tables: 1 · Supplementary: yes · References: 46</w:t>
       </w:r>
     </w:p>
     <w:p>
@@ -731,7 +731,7 @@
           <w:i w:val="0"/>
           <w:sz w:val="22"/>
         </w:rPr>
-        <w:t>The primary outcome was any postoperative seizure within the index admission, ascertained from chart documentation at BIDMC and from the structured seizure flag in eICU; cross-database phenotype agreement supports the external-validity claim. Two feature sets were defined by their availability at the intended decision point, the end of haematoma evacuation, before the antiepileptic-drug/EEG decision. The leakage-safe postoperative-B set comprised 18 demographic, operative and imaging-derived variables all available at that point. The postoperative-A set added three peri-decision variables (AED timing, proportion of stay on AED, abnormal EEG) that a clinician could not have at evacuation exit; because these encode information generated around or after the very decision the model is meant to inform, postoperative-A is reported only as a paired sensitivity comparison and is not deployable. The full feature dictionary is in Supplementary Appendix S3.</w:t>
+        <w:t>The primary outcome was any postoperative seizure within the index admission, ascertained from chart documentation at BIDMC and from the structured seizure flag in eICU; the two phenotypes are related but not identical, and the resulting limits on cross-cohort comparability are addressed in the Discussion. Two feature sets were defined by their availability at the intended decision point, the end of haematoma evacuation, before the antiepileptic-drug/EEG decision. The leakage-safe postoperative-B set comprised 18 demographic, operative and imaging-derived variables all available at that point. The postoperative-A set added three peri-decision variables (AED timing, proportion of stay on AED, abnormal EEG) that a clinician could not have at evacuation exit; because these encode information generated around or after the very decision the model is meant to inform, postoperative-A is reported only as a paired sensitivity comparison and is not deployable. The full feature dictionary is in Supplementary Appendix S3.</w:t>
       </w:r>
     </w:p>
     <w:p>
@@ -1708,7 +1708,7 @@
           <w:rFonts w:ascii="Times New Roman" w:hAnsi="Times New Roman"/>
           <w:sz w:val="20"/>
         </w:rPr>
-        <w:t>20. Anonymous. Tabular foundation models in clinical predictions: head-to-head benchmark. medRxiv. 2026; doi:10.64898/2026.02.02.26345274v1.</w:t>
+        <w:t>20. Tabular foundation models in clinical predictions: a head-to-head benchmark. medRxiv 2026 [preprint]. doi:10.64898/2026.02.02.26345274v1.</w:t>
       </w:r>
     </w:p>
     <w:p>

</xml_diff>

<commit_message>
JNNP compliance: 249-word abstract, 40 references, key-messages box; new F0 in README
- Compress structured abstract 478 -> 249 words; rename heading to Conclusions
- Add JNNP-required key-messages box (3 headings)
- Trim references 46 -> 40; cite eICU/SMOTE/Firth in Methods, renumber superscripts (all refs 1-40 now cited)
- README: new 4-step F0 methods flowchart as captioned hero image; fix stale manuscript title
- Add scripts/36_jnnp_submission_package.py (numbered title page + main + supplementary + TIFF figures + manifest)
- Sync rebuilt main_manuscript.docx and supplementary.docx
</commit_message>
<xml_diff>
--- a/docs/main_manuscript.docx
+++ b/docs/main_manuscript.docx
@@ -129,7 +129,7 @@
           <w:i w:val="0"/>
           <w:sz w:val="20"/>
         </w:rPr>
-        <w:t>Word count, abstract: 250 · main text: ~3,400 · Figures: 6 · Tables: 1 · Supplementary: yes · References: 46</w:t>
+        <w:t>Word count, abstract: 249 · main text: ~3,400 · Figures: 6 · Tables: 1 · Supplementary: yes · References: 40</w:t>
       </w:r>
     </w:p>
     <w:p>
@@ -299,7 +299,7 @@
           <w:i w:val="0"/>
           <w:sz w:val="22"/>
         </w:rPr>
-        <w:t>Postoperative seizure complicates 7–12% of chronic subdural haematoma (cSDH) evacuations, but routine antiepileptic drug (AED) prophylaxis carries fall, cognitive and drug-interaction risks specific to elderly patients, and its efficacy after cSDH is unproven. Calibrated risk stratification that can support individual treatment decisions is needed.</w:t>
+        <w:t>Postoperative seizure complicates 7–12% of chronic subdural haematoma (cSDH) evacuations, yet routine antiepileptic drug (AED) prophylaxis carries fall, cognitive and drug-interaction harms and has unproven efficacy after cSDH. Calibrated risk stratification is needed to guide treatment.</w:t>
       </w:r>
     </w:p>
     <w:p>
@@ -323,7 +323,7 @@
           <w:i w:val="0"/>
           <w:sz w:val="22"/>
         </w:rPr>
-        <w:t>We developed and externally evaluated a machine-learning risk score for postoperative seizure in 655 cSDH evacuations at BIDMC (development; 48 events) and 3,297 non-traumatic subdural haematoma ICU stays across 42 hospitals in the eICU Collaborative Research Database (external evaluation in a related population; 300 seizures). Eleven model classes were compared, including six SMOTE-family oversamplers, Optuna-tuned XGBoost and LightGBM, a diverse-base stacking ensemble, Bayesian logistic regression with eICU-informed priors, and Firth penalized logistic regression. Class-conditional (Mondrian) conformal prediction provided individual-patient decision sets. A probabilistic cost-effectiveness analysis with value-of-information (VOI) was run on 10,000 Monte Carlo iterations.</w:t>
+        <w:t>We developed and externally evaluated a seizure risk score in 655 cSDH evacuations at a single centre (48 events) and 3,297 non-traumatic subdural ICU stays across 42 hospitals in the eICU database (related population; 300 seizures). Eleven model classes were compared; class-conditional (Mondrian) conformal prediction supplied individual decision sets; and a probabilistic cost-effectiveness and value-of-information analysis used 10,000 iterations.</w:t>
       </w:r>
     </w:p>
     <w:p>
@@ -347,7 +347,7 @@
           <w:i w:val="0"/>
           <w:sz w:val="22"/>
         </w:rPr>
-        <w:t>Firth penalized logistic regression was the candidate model, fit on a leakage-safe postoperative-B feature set (18 variables available at the end of evacuation, before the AED/EEG decision); it discriminated at AUC 0.645. A postoperative-A set that additionally included three peri-decision variables reached AUC 0.681 (95% CI 0.609–0.753) but is not deployable, the difference lying within the Bernoulli noise floor at 48 events. Firth matched BalancedRandomForest discrimination (DeLong p = 0.81) with markedly better calibration (Brier 0.068 vs 0.228) and calibration-in-the-large near zero, though predictions remained under-dispersed (recalibration slope &gt;1) given the narrow probability range at 48 events. Eleven model classes converged on an AUC ceiling near 0.68 consistent with 2022–2025 meta-evidence. In external evaluation on a related (mixed-acuity ICU) population, AUC was 0.750 (0.711–0.774); random-effects pooled AUC across 42 hospitals was 0.684 (95% CI 0.651–0.714; logit-scale I²=0%, raw-scale 95% prediction interval 0.53–0.95). Class-conditional conformal prediction at α=0.10 gave confident singleton predictions in 22% of patients (rule-out 11%; rule-in 11%). ML-guided allocation — selective AED prophylaxis as the primary deployable strategy, or selective continuous-EEG monitoring where available — beat watchful observation and, at a matched treated fraction, beat random allocation (discrimination premium ≈$1,000–1,600/patient), confirming the model, not the treated fraction, added value. ML-guided allocation was preferred to universal AED under cSDH-plausible AED assumptions; universal AED was preferable only under optimistic, imported efficacy. Selective AED is the simplest to deploy and assumes AED has some efficacy, whereas selective monitoring retains value even if AED is ineffective. Population value of perfect information at $100k/QALY was approximately $23M over 10 years.</w:t>
+        <w:t>Firth penalized logistic regression, fit on a leakage-safe 18-variable set available before the AED/EEG decision, was the candidate model (AUC 0.645); a leakier postoperative-A set reached 0.681 but is not deployable. Firth matched BalancedRandomForest discrimination (DeLong p = 0.81) but calibrated markedly better (Brier 0.068 vs 0.228). External AUC was 0.750 (pooled 0.684 across 42 hospitals). Conformal prediction (α=0.10) gave singleton predictions in 22% of patients (11% rule-out, 11% rule-in). ML-guided AED allocation beat observation and, at a matched treated fraction, beat random allocation (≈$1,000–1,600/patient), and was preferred to universal AED under cSDH-plausible efficacy. Population value of information was ≈$23M over 10 years.</w:t>
       </w:r>
     </w:p>
     <w:p>
@@ -362,7 +362,7 @@
           <w:i w:val="0"/>
           <w:sz w:val="22"/>
         </w:rPr>
-        <w:t xml:space="preserve">Conclusion. </w:t>
+        <w:t xml:space="preserve">Conclusions. </w:t>
       </w:r>
       <w:r>
         <w:rPr>
@@ -371,7 +371,96 @@
           <w:i w:val="0"/>
           <w:sz w:val="22"/>
         </w:rPr>
-        <w:t>For postoperative seizure after cSDH evacuation, optimising small-cohort clinical machine learning for calibration and individual-patient decision support, rather than discrimination, yields a candidate model that meets methodological preconditions for prospective clinical evaluation. Selective, ML-guided AED prophylaxis is the primary deployable strategy, with selective continuous-EEG monitoring as an enhanced option where available; whether selective allocation is preferable to treating all or none hinges on AED efficacy and harm in cSDH, which current evidence leaves uncertain; value-of-information prioritises resolving these.</w:t>
+        <w:t>For postoperative seizure after cSDH evacuation, optimising small-cohort machine learning for calibration and decision support rather than discrimination yields a candidate model ready for prospective evaluation. Whether ML-guided AED prophylaxis beats treating all or none hinges on AED efficacy and harm in cSDH, which value-of-information prioritises resolving.</w:t>
+      </w:r>
+    </w:p>
+    <w:p>
+      <w:r>
+        <w:br w:type="page"/>
+      </w:r>
+    </w:p>
+    <w:p>
+      <w:pPr>
+        <w:pStyle w:val="Heading1"/>
+      </w:pPr>
+      <w:r>
+        <w:rPr>
+          <w:rFonts w:ascii="Times New Roman" w:hAnsi="Times New Roman"/>
+          <w:color w:val="141F3A"/>
+        </w:rPr>
+        <w:t>Key messages</w:t>
+      </w:r>
+    </w:p>
+    <w:p>
+      <w:pPr>
+        <w:spacing w:line="360" w:lineRule="auto" w:after="120"/>
+        <w:jc w:val="both"/>
+      </w:pPr>
+      <w:r>
+        <w:rPr>
+          <w:rFonts w:ascii="Times New Roman" w:hAnsi="Times New Roman"/>
+          <w:b/>
+          <w:i w:val="0"/>
+          <w:sz w:val="22"/>
+        </w:rPr>
+        <w:t xml:space="preserve">What is already known on this topic. </w:t>
+      </w:r>
+      <w:r>
+        <w:rPr>
+          <w:rFonts w:ascii="Times New Roman" w:hAnsi="Times New Roman"/>
+          <w:b w:val="0"/>
+          <w:i w:val="0"/>
+          <w:sz w:val="22"/>
+        </w:rPr>
+        <w:t>Postoperative seizure is a common and consequential complication of cSDH evacuation, but whether to give antiepileptic prophylaxis is unresolved; prior machine-learning models were single-centre, reported discrimination only, and offered no calibration, external validation or decision support.</w:t>
+      </w:r>
+    </w:p>
+    <w:p>
+      <w:pPr>
+        <w:spacing w:line="360" w:lineRule="auto" w:after="120"/>
+        <w:jc w:val="both"/>
+      </w:pPr>
+      <w:r>
+        <w:rPr>
+          <w:rFonts w:ascii="Times New Roman" w:hAnsi="Times New Roman"/>
+          <w:b/>
+          <w:i w:val="0"/>
+          <w:sz w:val="22"/>
+        </w:rPr>
+        <w:t xml:space="preserve">What this study adds. </w:t>
+      </w:r>
+      <w:r>
+        <w:rPr>
+          <w:rFonts w:ascii="Times New Roman" w:hAnsi="Times New Roman"/>
+          <w:b w:val="0"/>
+          <w:i w:val="0"/>
+          <w:sz w:val="22"/>
+        </w:rPr>
+        <w:t>Optimising a small-cohort model for calibration rather than discrimination produced a parametric, leakage-safe candidate score that is well calibrated and, wrapped in class-conditional conformal prediction, returns a confident rule-in or rule-out in about a fifth of patients. A probabilistic cost-effectiveness and value-of-information analysis shows model-guided AED allocation adds value beyond the treated fraction and is preferred to treating all under cSDH-plausible efficacy.</w:t>
+      </w:r>
+    </w:p>
+    <w:p>
+      <w:pPr>
+        <w:spacing w:line="360" w:lineRule="auto" w:after="120"/>
+        <w:jc w:val="both"/>
+      </w:pPr>
+      <w:r>
+        <w:rPr>
+          <w:rFonts w:ascii="Times New Roman" w:hAnsi="Times New Roman"/>
+          <w:b/>
+          <w:i w:val="0"/>
+          <w:sz w:val="22"/>
+        </w:rPr>
+        <w:t xml:space="preserve">How this study might affect research, practice or policy. </w:t>
+      </w:r>
+      <w:r>
+        <w:rPr>
+          <w:rFonts w:ascii="Times New Roman" w:hAnsi="Times New Roman"/>
+          <w:b w:val="0"/>
+          <w:i w:val="0"/>
+          <w:sz w:val="22"/>
+        </w:rPr>
+        <w:t>The model meets methodological preconditions for prospective evaluation and provides an explicit "do-not-know" signal for bedside use; the dominant remaining uncertainty is AED efficacy and harm in cSDH, which value-of-information identifies as the priority for future trials.</w:t>
       </w:r>
     </w:p>
     <w:p>
@@ -677,6 +766,16 @@
         </w:rPr>
         <w:t xml:space="preserve"> The BIDMC analysis was approved by the institutional review board (Protocol [IRB number to be inserted]); the eICU Collaborative Research Database v2.0 was accessed under its data-use agreement.</w:t>
       </w:r>
+      <w:r>
+        <w:rPr>
+          <w:rFonts w:ascii="Times New Roman" w:hAnsi="Times New Roman"/>
+          <w:b w:val="0"/>
+          <w:i w:val="0"/>
+          <w:sz w:val="22"/>
+          <w:vertAlign w:val="superscript"/>
+        </w:rPr>
+        <w:t>³⁰</w:t>
+      </w:r>
     </w:p>
     <w:p>
       <w:pPr>
@@ -759,7 +858,45 @@
           <w:i w:val="0"/>
           <w:sz w:val="22"/>
         </w:rPr>
-        <w:t>Eleven model classes were compared: the prior version's BalancedRandomForest (BRF) reference; Firth penalized logistic regression; Bayesian logistic regression with weakly-informative and eICU-informed priors; class-weighted RandomForest; six SMOTE-family oversampling variants (SMOTE, Borderline-SMOTE, SVM-SMOTE, ADASYN, SMOTEENN, SMOTETomek); Optuna-tuned XGBoost and LightGBM (40 trials each); and a diverse-base stacking ensemble (logistic regression, BRF, XGBoost, k-nearest neighbours and RBF-SVM) with logistic meta-learner. Models were evaluated by 5×5 repeated stratified cross-validation with bootstrap 95% confidence intervals on AUC, Brier score, calibration-in-the-large, calibration slope and intercept. Paired comparisons against BRF used the DeLong test. Firth penalized logistic regression on the leakage-safe postoperative-B set was the pre-specified candidate model, chosen for calibration and interpretability rather than discrimination; BalancedRandomForest served only as the DeLong comparison anchor and was not a deployment candidate (poor calibration, Brier 0.228). All resampling, hyperparameter tuning and Platt recalibration were performed strictly within the training folds of the outer cross-validation; no test-fold data informed preprocessing or model selection.</w:t>
+        <w:t>Eleven model classes were compared: the prior version's BalancedRandomForest (BRF) reference; Firth penalized logistic regression</w:t>
+      </w:r>
+      <w:r>
+        <w:rPr>
+          <w:rFonts w:ascii="Times New Roman" w:hAnsi="Times New Roman"/>
+          <w:b w:val="0"/>
+          <w:i w:val="0"/>
+          <w:sz w:val="22"/>
+          <w:vertAlign w:val="superscript"/>
+        </w:rPr>
+        <w:t>³²</w:t>
+      </w:r>
+      <w:r>
+        <w:rPr>
+          <w:rFonts w:ascii="Times New Roman" w:hAnsi="Times New Roman"/>
+          <w:b w:val="0"/>
+          <w:i w:val="0"/>
+          <w:sz w:val="22"/>
+        </w:rPr>
+        <w:t>; Bayesian logistic regression with weakly-informative and eICU-informed priors; class-weighted RandomForest; six SMOTE-family oversampling variants (SMOTE, Borderline-SMOTE, SVM-SMOTE, ADASYN, SMOTEENN, SMOTETomek)</w:t>
+      </w:r>
+      <w:r>
+        <w:rPr>
+          <w:rFonts w:ascii="Times New Roman" w:hAnsi="Times New Roman"/>
+          <w:b w:val="0"/>
+          <w:i w:val="0"/>
+          <w:sz w:val="22"/>
+          <w:vertAlign w:val="superscript"/>
+        </w:rPr>
+        <w:t>³¹</w:t>
+      </w:r>
+      <w:r>
+        <w:rPr>
+          <w:rFonts w:ascii="Times New Roman" w:hAnsi="Times New Roman"/>
+          <w:b w:val="0"/>
+          <w:i w:val="0"/>
+          <w:sz w:val="22"/>
+        </w:rPr>
+        <w:t>; Optuna-tuned XGBoost and LightGBM (40 trials each); and a diverse-base stacking ensemble (logistic regression, BRF, XGBoost, k-nearest neighbours and RBF-SVM) with logistic meta-learner. Models were evaluated by 5×5 repeated stratified cross-validation with bootstrap 95% confidence intervals on AUC, Brier score, calibration-in-the-large, calibration slope and intercept. Paired comparisons against BRF used the DeLong test. Firth penalized logistic regression on the leakage-safe postoperative-B set was the pre-specified candidate model, chosen for calibration and interpretability rather than discrimination; BalancedRandomForest served only as the DeLong comparison anchor and was not a deployment candidate (poor calibration, Brier 0.228). All resampling, hyperparameter tuning and Platt recalibration were performed strictly within the training folds of the outer cross-validation; no test-fold data informed preprocessing or model selection.</w:t>
       </w:r>
     </w:p>
     <w:p>
@@ -863,7 +1000,7 @@
           <w:sz w:val="22"/>
           <w:vertAlign w:val="superscript"/>
         </w:rPr>
-        <w:t>³⁹,⁴⁰</w:t>
+        <w:t>³³,³⁴</w:t>
       </w:r>
       <w:r>
         <w:rPr>
@@ -882,7 +1019,7 @@
           <w:sz w:val="22"/>
           <w:vertAlign w:val="superscript"/>
         </w:rPr>
-        <w:t>⁴¹,⁴²</w:t>
+        <w:t>³⁵,³⁶</w:t>
       </w:r>
       <w:r>
         <w:rPr>
@@ -1340,7 +1477,7 @@
           <w:sz w:val="22"/>
           <w:vertAlign w:val="superscript"/>
         </w:rPr>
-        <w:t>⁴³⁻⁴⁶</w:t>
+        <w:t>³⁷⁻⁴⁰</w:t>
       </w:r>
       <w:r>
         <w:rPr>
@@ -1840,7 +1977,7 @@
           <w:rFonts w:ascii="Times New Roman" w:hAnsi="Times New Roman"/>
           <w:sz w:val="20"/>
         </w:rPr>
-        <w:t>31. Johnson AEW, Bulgarelli L, Shen L, et al. MIMIC-IV, a freely accessible electronic health record dataset. Sci Data. 2023;10:1.</w:t>
+        <w:t>31. Chawla NV, Bowyer KW, Hall LO, Kegelmeyer WP. SMOTE. J Artif Intell Res. 2002;16:321–57.</w:t>
       </w:r>
     </w:p>
     <w:p>
@@ -1852,7 +1989,7 @@
           <w:rFonts w:ascii="Times New Roman" w:hAnsi="Times New Roman"/>
           <w:sz w:val="20"/>
         </w:rPr>
-        <w:t>32. Chawla NV, Bowyer KW, Hall LO, Kegelmeyer WP. SMOTE. J Artif Intell Res. 2002;16:321–57.</w:t>
+        <w:t>32. Firth D. Bias reduction of maximum likelihood estimates. Biometrika. 1993;80(1):27–38.</w:t>
       </w:r>
     </w:p>
     <w:p>
@@ -1864,7 +2001,7 @@
           <w:rFonts w:ascii="Times New Roman" w:hAnsi="Times New Roman"/>
           <w:sz w:val="20"/>
         </w:rPr>
-        <w:t>33. Han H, Wang W, Mao B. Borderline-SMOTE. ICIC. 2005;3644:878–87.</w:t>
+        <w:t>33. Löfström T, Boström H, Linusson H, Johansson U. Mondrian cross-conformal prediction on imbalanced bioactivity data. J Chem Inf Model. 2017;57(7):1591–8.</w:t>
       </w:r>
     </w:p>
     <w:p>
@@ -1876,7 +2013,7 @@
           <w:rFonts w:ascii="Times New Roman" w:hAnsi="Times New Roman"/>
           <w:sz w:val="20"/>
         </w:rPr>
-        <w:t>34. Nguyen HM, Cooper EW, Kamei K. SVM-SMOTE. Int J Knowl Eng Soft Data Paradigms. 2011;3:4–21.</w:t>
+        <w:t>34. Vovk V. Conditional validity of inductive conformal predictors. Proc Mach Learn Res (ACML). 2012;25:475–90.</w:t>
       </w:r>
     </w:p>
     <w:p>
@@ -1888,7 +2025,7 @@
           <w:rFonts w:ascii="Times New Roman" w:hAnsi="Times New Roman"/>
           <w:sz w:val="20"/>
         </w:rPr>
-        <w:t>35. Firth D. Bias reduction of maximum likelihood estimates. Biometrika. 1993;80(1):27–38.</w:t>
+        <w:t>35. Romano Y, Sesia M, Candès EJ. Classification with valid and adaptive coverage. NeurIPS. 2020. arXiv:2006.02544.</w:t>
       </w:r>
     </w:p>
     <w:p>
@@ -1900,7 +2037,7 @@
           <w:rFonts w:ascii="Times New Roman" w:hAnsi="Times New Roman"/>
           <w:sz w:val="20"/>
         </w:rPr>
-        <w:t>36. Puhr R, Heinze G, Nold M, Lusa L, Geroldinger A. Firth's logistic regression with rare events. Stat Med. 2017;36(14):2302–17.</w:t>
+        <w:t>36. Olsson H, Kartasalo K, Mulliqi N, et al. Conformal selective prediction with cost-aware deferral for safe clinical triage under distribution shift. Sci Rep. 2026 (in press).</w:t>
       </w:r>
     </w:p>
     <w:p>
@@ -1912,7 +2049,7 @@
           <w:rFonts w:ascii="Times New Roman" w:hAnsi="Times New Roman"/>
           <w:sz w:val="20"/>
         </w:rPr>
-        <w:t>37. DerSimonian R, Laird N. Meta-analysis in clinical trials. Control Clin Trials. 1986;7(3):177–88.</w:t>
+        <w:t>37. Pacheco-Barrios N, Pacheco-Barrios K, et al. Prophylactic antiepileptic drugs in chronic subdural haematoma: systematic review and meta-analysis. Neurosurgery. 2024; doi:10.1227/neu.0000000000003183.</w:t>
       </w:r>
     </w:p>
     <w:p>
@@ -1924,7 +2061,7 @@
           <w:rFonts w:ascii="Times New Roman" w:hAnsi="Times New Roman"/>
           <w:sz w:val="20"/>
         </w:rPr>
-        <w:t>38. Geskus RB. Cause-specific cumulative incidence estimation under competing risks (IPCW). Biometrics. 2011;67:39–49.</w:t>
+        <w:t>38. Nachiappan DS, Garg K. Role of prophylactic antiepileptic drugs in chronic subdural haematoma: a systematic review and meta-analysis. Neurosurg Rev. 2021;44(4):2069–77.</w:t>
       </w:r>
     </w:p>
     <w:p>
@@ -1936,7 +2073,7 @@
           <w:rFonts w:ascii="Times New Roman" w:hAnsi="Times New Roman"/>
           <w:sz w:val="20"/>
         </w:rPr>
-        <w:t>39. Löfström T, Boström H, Linusson H, Johansson U. Mondrian cross-conformal prediction on imbalanced bioactivity data. J Chem Inf Model. 2017;57(7):1591–8.</w:t>
+        <w:t>39. Ratilal BO, Pappamikail L, Costa J, Sampaio C. Anticonvulsants for preventing seizures in patients with chronic subdural haematoma. Cochrane Database Syst Rev. 2013;(6):CD004893.</w:t>
       </w:r>
     </w:p>
     <w:p>
@@ -1948,79 +2085,7 @@
           <w:rFonts w:ascii="Times New Roman" w:hAnsi="Times New Roman"/>
           <w:sz w:val="20"/>
         </w:rPr>
-        <w:t>40. Vovk V. Conditional validity of inductive conformal predictors. Proc Mach Learn Res (ACML). 2012;25:475–90.</w:t>
-      </w:r>
-    </w:p>
-    <w:p>
-      <w:pPr>
-        <w:ind w:hanging="432" w:left="432"/>
-      </w:pPr>
-      <w:r>
-        <w:rPr>
-          <w:rFonts w:ascii="Times New Roman" w:hAnsi="Times New Roman"/>
-          <w:sz w:val="20"/>
-        </w:rPr>
-        <w:t>41. Romano Y, Sesia M, Candès EJ. Classification with valid and adaptive coverage. NeurIPS. 2020. arXiv:2006.02544.</w:t>
-      </w:r>
-    </w:p>
-    <w:p>
-      <w:pPr>
-        <w:ind w:hanging="432" w:left="432"/>
-      </w:pPr>
-      <w:r>
-        <w:rPr>
-          <w:rFonts w:ascii="Times New Roman" w:hAnsi="Times New Roman"/>
-          <w:sz w:val="20"/>
-        </w:rPr>
-        <w:t>42. Olsson H, Kartasalo K, Mulliqi N, et al. Conformal selective prediction with cost-aware deferral for safe clinical triage under distribution shift. Sci Rep. 2026 (in press).</w:t>
-      </w:r>
-    </w:p>
-    <w:p>
-      <w:pPr>
-        <w:ind w:hanging="432" w:left="432"/>
-      </w:pPr>
-      <w:r>
-        <w:rPr>
-          <w:rFonts w:ascii="Times New Roman" w:hAnsi="Times New Roman"/>
-          <w:sz w:val="20"/>
-        </w:rPr>
-        <w:t>43. Pacheco-Barrios N, Pacheco-Barrios K, et al. Prophylactic antiepileptic drugs in chronic subdural haematoma: systematic review and meta-analysis. Neurosurgery. 2024; doi:10.1227/neu.0000000000003183.</w:t>
-      </w:r>
-    </w:p>
-    <w:p>
-      <w:pPr>
-        <w:ind w:hanging="432" w:left="432"/>
-      </w:pPr>
-      <w:r>
-        <w:rPr>
-          <w:rFonts w:ascii="Times New Roman" w:hAnsi="Times New Roman"/>
-          <w:sz w:val="20"/>
-        </w:rPr>
-        <w:t>44. Nachiappan DS, Garg K. Role of prophylactic antiepileptic drugs in chronic subdural haematoma: a systematic review and meta-analysis. Neurosurg Rev. 2021;44(4):2069–77.</w:t>
-      </w:r>
-    </w:p>
-    <w:p>
-      <w:pPr>
-        <w:ind w:hanging="432" w:left="432"/>
-      </w:pPr>
-      <w:r>
-        <w:rPr>
-          <w:rFonts w:ascii="Times New Roman" w:hAnsi="Times New Roman"/>
-          <w:sz w:val="20"/>
-        </w:rPr>
-        <w:t>45. Ratilal BO, Pappamikail L, Costa J, Sampaio C. Anticonvulsants for preventing seizures in patients with chronic subdural haematoma. Cochrane Database Syst Rev. 2013;(6):CD004893.</w:t>
-      </w:r>
-    </w:p>
-    <w:p>
-      <w:pPr>
-        <w:ind w:hanging="432" w:left="432"/>
-      </w:pPr>
-      <w:r>
-        <w:rPr>
-          <w:rFonts w:ascii="Times New Roman" w:hAnsi="Times New Roman"/>
-          <w:sz w:val="20"/>
-        </w:rPr>
-        <w:t>46. Lavergne P, Labidi M, Brunette-Clément T, et al. Efficacy of antiseizure prophylaxis in chronic subdural haematoma: a cohort study on routinely collected health data. J Neurosurg. 2019;132(1):284–91.</w:t>
+        <w:t>40. Lavergne P, Labidi M, Brunette-Clément T, et al. Efficacy of antiseizure prophylaxis in chronic subdural haematoma: a cohort study on routinely collected health data. J Neurosurg. 2019;132(1):284–91.</w:t>
       </w:r>
     </w:p>
     <w:p>

</xml_diff>